<commit_message>
Mejora Formatos solucion campos y agregacion fotografias
</commit_message>
<xml_diff>
--- a/Backend/src/templates/qas/FOR Acta QA adición de teléfonos y capacitación.docx
+++ b/Backend/src/templates/qas/FOR Acta QA adición de teléfonos y capacitación.docx
@@ -1,6 +1,6 @@
 
 <file path=word/document.xml><?xml version="1.0" encoding="utf-8"?>
-<w:document xmlns:wpc="http://schemas.microsoft.com/office/word/2010/wordprocessingCanvas" xmlns:cx="http://schemas.microsoft.com/office/drawing/2014/chartex" xmlns:cx1="http://schemas.microsoft.com/office/drawing/2015/9/8/chartex" xmlns:cx2="http://schemas.microsoft.com/office/drawing/2015/10/21/chartex" xmlns:cx3="http://schemas.microsoft.com/office/drawing/2016/5/9/chartex" xmlns:cx4="http://schemas.microsoft.com/office/drawing/2016/5/10/chartex" xmlns:cx5="http://schemas.microsoft.com/office/drawing/2016/5/11/chartex" xmlns:cx6="http://schemas.microsoft.com/office/drawing/2016/5/12/chartex" xmlns:cx7="http://schemas.microsoft.com/office/drawing/2016/5/13/chartex" xmlns:cx8="http://schemas.microsoft.com/office/drawing/2016/5/14/chartex" xmlns:mc="http://schemas.openxmlformats.org/markup-compatibility/2006" xmlns:aink="http://schemas.microsoft.com/office/drawing/2016/ink" xmlns:am3d="http://schemas.microsoft.com/office/drawing/2017/model3d" xmlns:o="urn:schemas-microsoft-com:office:office" xmlns:oel="http://schemas.microsoft.com/office/2019/extlst" xmlns:r="http://schemas.openxmlformats.org/officeDocument/2006/relationships" xmlns:m="http://schemas.openxmlformats.org/officeDocument/2006/math" xmlns:v="urn:schemas-microsoft-com:vml" xmlns:wp14="http://schemas.microsoft.com/office/word/2010/wordprocessingDrawing" xmlns:wp="http://schemas.openxmlformats.org/drawingml/2006/wordprocessingDrawing" xmlns:w10="urn:schemas-microsoft-com:office:word" xmlns:w="http://schemas.openxmlformats.org/wordprocessingml/2006/main" xmlns:w14="http://schemas.microsoft.com/office/word/2010/wordml" xmlns:w15="http://schemas.microsoft.com/office/word/2012/wordml" xmlns:w16cex="http://schemas.microsoft.com/office/word/2018/wordml/cex" xmlns:w16cid="http://schemas.microsoft.com/office/word/2016/wordml/cid" xmlns:w16="http://schemas.microsoft.com/office/word/2018/wordml" xmlns:w16du="http://schemas.microsoft.com/office/word/2023/wordml/word16du" xmlns:w16sdtdh="http://schemas.microsoft.com/office/word/2020/wordml/sdtdatahash" xmlns:w16se="http://schemas.microsoft.com/office/word/2015/wordml/symex" xmlns:wpg="http://schemas.microsoft.com/office/word/2010/wordprocessingGroup" xmlns:wpi="http://schemas.microsoft.com/office/word/2010/wordprocessingInk" xmlns:wne="http://schemas.microsoft.com/office/word/2006/wordml" xmlns:wps="http://schemas.microsoft.com/office/word/2010/wordprocessingShape" mc:Ignorable="w14 w15 w16se w16cid w16 w16cex w16sdtdh w16du wp14">
+<w:document xmlns:wpc="http://schemas.microsoft.com/office/word/2010/wordprocessingCanvas" xmlns:cx="http://schemas.microsoft.com/office/drawing/2014/chartex" xmlns:cx1="http://schemas.microsoft.com/office/drawing/2015/9/8/chartex" xmlns:cx2="http://schemas.microsoft.com/office/drawing/2015/10/21/chartex" xmlns:cx3="http://schemas.microsoft.com/office/drawing/2016/5/9/chartex" xmlns:cx4="http://schemas.microsoft.com/office/drawing/2016/5/10/chartex" xmlns:cx5="http://schemas.microsoft.com/office/drawing/2016/5/11/chartex" xmlns:cx6="http://schemas.microsoft.com/office/drawing/2016/5/12/chartex" xmlns:cx7="http://schemas.microsoft.com/office/drawing/2016/5/13/chartex" xmlns:cx8="http://schemas.microsoft.com/office/drawing/2016/5/14/chartex" xmlns:mc="http://schemas.openxmlformats.org/markup-compatibility/2006" xmlns:aink="http://schemas.microsoft.com/office/drawing/2016/ink" xmlns:am3d="http://schemas.microsoft.com/office/drawing/2017/model3d" xmlns:o="urn:schemas-microsoft-com:office:office" xmlns:oel="http://schemas.microsoft.com/office/2019/extlst" xmlns:r="http://schemas.openxmlformats.org/officeDocument/2006/relationships" xmlns:m="http://schemas.openxmlformats.org/officeDocument/2006/math" xmlns:v="urn:schemas-microsoft-com:vml" xmlns:wp14="http://schemas.microsoft.com/office/word/2010/wordprocessingDrawing" xmlns:wp="http://schemas.openxmlformats.org/drawingml/2006/wordprocessingDrawing" xmlns:w10="urn:schemas-microsoft-com:office:word" xmlns:w="http://schemas.openxmlformats.org/wordprocessingml/2006/main" xmlns:w14="http://schemas.microsoft.com/office/word/2010/wordml" xmlns:w15="http://schemas.microsoft.com/office/word/2012/wordml" xmlns:w16cex="http://schemas.microsoft.com/office/word/2018/wordml/cex" xmlns:w16cid="http://schemas.microsoft.com/office/word/2016/wordml/cid" xmlns:w16="http://schemas.microsoft.com/office/word/2018/wordml" xmlns:w16du="http://schemas.microsoft.com/office/word/2023/wordml/word16du" xmlns:w16sdtdh="http://schemas.microsoft.com/office/word/2020/wordml/sdtdatahash" xmlns:w16sdtfl="http://schemas.microsoft.com/office/word/2024/wordml/sdtformatlock" xmlns:w16se="http://schemas.microsoft.com/office/word/2015/wordml/symex" xmlns:wpg="http://schemas.microsoft.com/office/word/2010/wordprocessingGroup" xmlns:wpi="http://schemas.microsoft.com/office/word/2010/wordprocessingInk" xmlns:wne="http://schemas.microsoft.com/office/word/2006/wordml" xmlns:wps="http://schemas.microsoft.com/office/word/2010/wordprocessingShape" mc:Ignorable="w14 w15 w16se w16cid w16 w16cex w16sdtdh w16sdtfl w16du wp14">
   <w:body>
     <w:p>
       <w:pPr>
@@ -2700,7 +2700,27 @@
           <w:sz w:val="18"/>
         </w:rPr>
         <w:br/>
-        <w:t>{foto_antes_instalacion}</w:t>
+        <w:t>{</w:t>
+      </w:r>
+      <w:r>
+        <w:rPr>
+          <w:sz w:val="18"/>
+        </w:rPr>
+        <w:t>%</w:t>
+      </w:r>
+      <w:proofErr w:type="spellStart"/>
+      <w:r>
+        <w:rPr>
+          <w:sz w:val="18"/>
+        </w:rPr>
+        <w:t>foto_antes_instalacion</w:t>
+      </w:r>
+      <w:proofErr w:type="spellEnd"/>
+      <w:r>
+        <w:rPr>
+          <w:sz w:val="18"/>
+        </w:rPr>
+        <w:t>}</w:t>
       </w:r>
     </w:p>
     <w:p>
@@ -2827,7 +2847,27 @@
           <w:sz w:val="18"/>
         </w:rPr>
         <w:br/>
-        <w:t>{foto_despues_instalacion}</w:t>
+        <w:t>{</w:t>
+      </w:r>
+      <w:r>
+        <w:rPr>
+          <w:sz w:val="18"/>
+        </w:rPr>
+        <w:t>%</w:t>
+      </w:r>
+      <w:proofErr w:type="spellStart"/>
+      <w:r>
+        <w:rPr>
+          <w:sz w:val="18"/>
+        </w:rPr>
+        <w:t>foto_despues_instalacion</w:t>
+      </w:r>
+      <w:proofErr w:type="spellEnd"/>
+      <w:r>
+        <w:rPr>
+          <w:sz w:val="18"/>
+        </w:rPr>
+        <w:t>}</w:t>
       </w:r>
     </w:p>
     <w:p>
@@ -2955,7 +2995,27 @@
           <w:sz w:val="18"/>
         </w:rPr>
         <w:br/>
-        <w:t>{foto_marquillas_completas}</w:t>
+        <w:t>{</w:t>
+      </w:r>
+      <w:r>
+        <w:rPr>
+          <w:sz w:val="18"/>
+        </w:rPr>
+        <w:t>%</w:t>
+      </w:r>
+      <w:proofErr w:type="spellStart"/>
+      <w:r>
+        <w:rPr>
+          <w:sz w:val="18"/>
+        </w:rPr>
+        <w:t>foto_marquillas_completas</w:t>
+      </w:r>
+      <w:proofErr w:type="spellEnd"/>
+      <w:r>
+        <w:rPr>
+          <w:sz w:val="18"/>
+        </w:rPr>
+        <w:t>}</w:t>
       </w:r>
     </w:p>
     <w:p>
@@ -3074,7 +3134,27 @@
           <w:sz w:val="18"/>
         </w:rPr>
         <w:br/>
-        <w:t>{foto_tomas_electricas}</w:t>
+        <w:t>{</w:t>
+      </w:r>
+      <w:r>
+        <w:rPr>
+          <w:sz w:val="18"/>
+        </w:rPr>
+        <w:t>%</w:t>
+      </w:r>
+      <w:proofErr w:type="spellStart"/>
+      <w:r>
+        <w:rPr>
+          <w:sz w:val="18"/>
+        </w:rPr>
+        <w:t>foto_tomas_electricas</w:t>
+      </w:r>
+      <w:proofErr w:type="spellEnd"/>
+      <w:r>
+        <w:rPr>
+          <w:sz w:val="18"/>
+        </w:rPr>
+        <w:t>}</w:t>
       </w:r>
     </w:p>
     <w:p>
@@ -3188,7 +3268,27 @@
           <w:sz w:val="18"/>
         </w:rPr>
         <w:br/>
-        <w:t>{foto_voltaje_neutro_tierra}</w:t>
+        <w:t>{</w:t>
+      </w:r>
+      <w:r>
+        <w:rPr>
+          <w:sz w:val="18"/>
+        </w:rPr>
+        <w:t>%</w:t>
+      </w:r>
+      <w:proofErr w:type="spellStart"/>
+      <w:r>
+        <w:rPr>
+          <w:sz w:val="18"/>
+        </w:rPr>
+        <w:t>foto_voltaje_neutro_tierra</w:t>
+      </w:r>
+      <w:proofErr w:type="spellEnd"/>
+      <w:r>
+        <w:rPr>
+          <w:sz w:val="18"/>
+        </w:rPr>
+        <w:t>}</w:t>
       </w:r>
     </w:p>
     <w:p>
@@ -3396,7 +3496,6 @@
               <w:bottom w:val="single" w:sz="4" w:space="0" w:color="auto"/>
               <w:right w:val="single" w:sz="4" w:space="0" w:color="auto"/>
             </w:tcBorders>
-            <w:shd w:val="clear" w:color="auto" w:fill="auto"/>
             <w:noWrap/>
             <w:vAlign w:val="bottom"/>
           </w:tcPr>
@@ -3411,7 +3510,21 @@
               <w:rPr>
                 <w:sz w:val="12"/>
               </w:rPr>
-              <w:t>{srst_sin_wan_sin_call_manager_si}</w:t>
+              <w:t>{</w:t>
+            </w:r>
+            <w:proofErr w:type="spellStart"/>
+            <w:r>
+              <w:rPr>
+                <w:sz w:val="12"/>
+              </w:rPr>
+              <w:t>srst_sin_wan_sin_call_manager_si</w:t>
+            </w:r>
+            <w:proofErr w:type="spellEnd"/>
+            <w:r>
+              <w:rPr>
+                <w:sz w:val="12"/>
+              </w:rPr>
+              <w:t>}</w:t>
             </w:r>
           </w:p>
         </w:tc>
@@ -3453,7 +3566,6 @@
               <w:bottom w:val="single" w:sz="4" w:space="0" w:color="auto"/>
               <w:right w:val="single" w:sz="4" w:space="0" w:color="auto"/>
             </w:tcBorders>
-            <w:shd w:val="clear" w:color="auto" w:fill="auto"/>
             <w:noWrap/>
             <w:vAlign w:val="bottom"/>
           </w:tcPr>
@@ -3467,7 +3579,21 @@
               <w:rPr>
                 <w:sz w:val="12"/>
               </w:rPr>
-              <w:t>{srst_sin_wan_sin_call_manager_no}</w:t>
+              <w:t>{</w:t>
+            </w:r>
+            <w:proofErr w:type="spellStart"/>
+            <w:r>
+              <w:rPr>
+                <w:sz w:val="12"/>
+              </w:rPr>
+              <w:t>srst_sin_wan_sin_call_manager_no</w:t>
+            </w:r>
+            <w:proofErr w:type="spellEnd"/>
+            <w:r>
+              <w:rPr>
+                <w:sz w:val="12"/>
+              </w:rPr>
+              <w:t>}</w:t>
             </w:r>
           </w:p>
         </w:tc>
@@ -3506,20 +3632,33 @@
               <w:bottom w:val="single" w:sz="4" w:space="0" w:color="auto"/>
               <w:right w:val="single" w:sz="4" w:space="0" w:color="auto"/>
             </w:tcBorders>
-            <w:shd w:val="clear" w:color="auto" w:fill="auto"/>
-            <w:vAlign w:val="bottom"/>
-          </w:tcPr>
-          <w:p>
-            <w:pPr>
-              <w:rPr>
-                <w:rFonts w:ascii="Arial" w:hAnsi="Arial" w:cs="Arial"/>
-              </w:rPr>
-            </w:pPr>
-            <w:r>
-              <w:rPr>
-                <w:sz w:val="12"/>
-              </w:rPr>
-              <w:t>{srst_sin_wan_sin_call_manager_na}</w:t>
+            <w:vAlign w:val="bottom"/>
+          </w:tcPr>
+          <w:p>
+            <w:pPr>
+              <w:rPr>
+                <w:rFonts w:ascii="Arial" w:hAnsi="Arial" w:cs="Arial"/>
+              </w:rPr>
+            </w:pPr>
+            <w:r>
+              <w:rPr>
+                <w:sz w:val="12"/>
+              </w:rPr>
+              <w:t>{</w:t>
+            </w:r>
+            <w:proofErr w:type="spellStart"/>
+            <w:r>
+              <w:rPr>
+                <w:sz w:val="12"/>
+              </w:rPr>
+              <w:t>srst_sin_wan_sin_call_manager_na</w:t>
+            </w:r>
+            <w:proofErr w:type="spellEnd"/>
+            <w:r>
+              <w:rPr>
+                <w:sz w:val="12"/>
+              </w:rPr>
+              <w:t>}</w:t>
             </w:r>
           </w:p>
         </w:tc>
@@ -3566,7 +3705,6 @@
         <w:t>Movilidad de extensiones-</w:t>
       </w:r>
       <w:proofErr w:type="spellStart"/>
-      <w:proofErr w:type="gramStart"/>
       <w:r>
         <w:rPr>
           <w:rFonts w:ascii="Arial" w:hAnsi="Arial" w:cs="Arial"/>
@@ -3576,7 +3714,6 @@
         <w:t>password</w:t>
       </w:r>
       <w:proofErr w:type="spellEnd"/>
-      <w:proofErr w:type="gramEnd"/>
     </w:p>
     <w:p>
       <w:pPr>
@@ -3642,7 +3779,6 @@
               <w:bottom w:val="single" w:sz="4" w:space="0" w:color="auto"/>
               <w:right w:val="single" w:sz="4" w:space="0" w:color="auto"/>
             </w:tcBorders>
-            <w:shd w:val="clear" w:color="auto" w:fill="auto"/>
             <w:noWrap/>
             <w:vAlign w:val="bottom"/>
           </w:tcPr>
@@ -3657,7 +3793,21 @@
               <w:rPr>
                 <w:sz w:val="12"/>
               </w:rPr>
-              <w:t>{movilidad_extensiones_password_si}</w:t>
+              <w:t>{</w:t>
+            </w:r>
+            <w:proofErr w:type="spellStart"/>
+            <w:r>
+              <w:rPr>
+                <w:sz w:val="12"/>
+              </w:rPr>
+              <w:t>movilidad_extensiones_password_si</w:t>
+            </w:r>
+            <w:proofErr w:type="spellEnd"/>
+            <w:r>
+              <w:rPr>
+                <w:sz w:val="12"/>
+              </w:rPr>
+              <w:t>}</w:t>
             </w:r>
           </w:p>
         </w:tc>
@@ -3699,7 +3849,6 @@
               <w:bottom w:val="single" w:sz="4" w:space="0" w:color="auto"/>
               <w:right w:val="single" w:sz="4" w:space="0" w:color="auto"/>
             </w:tcBorders>
-            <w:shd w:val="clear" w:color="auto" w:fill="auto"/>
             <w:noWrap/>
             <w:vAlign w:val="bottom"/>
           </w:tcPr>
@@ -3713,7 +3862,21 @@
               <w:rPr>
                 <w:sz w:val="12"/>
               </w:rPr>
-              <w:t>{movilidad_extensiones_password_no}</w:t>
+              <w:t>{</w:t>
+            </w:r>
+            <w:proofErr w:type="spellStart"/>
+            <w:r>
+              <w:rPr>
+                <w:sz w:val="12"/>
+              </w:rPr>
+              <w:t>movilidad_extensiones_password_no</w:t>
+            </w:r>
+            <w:proofErr w:type="spellEnd"/>
+            <w:r>
+              <w:rPr>
+                <w:sz w:val="12"/>
+              </w:rPr>
+              <w:t>}</w:t>
             </w:r>
           </w:p>
         </w:tc>
@@ -3752,20 +3915,33 @@
               <w:bottom w:val="single" w:sz="4" w:space="0" w:color="auto"/>
               <w:right w:val="single" w:sz="4" w:space="0" w:color="auto"/>
             </w:tcBorders>
-            <w:shd w:val="clear" w:color="auto" w:fill="auto"/>
-            <w:vAlign w:val="bottom"/>
-          </w:tcPr>
-          <w:p>
-            <w:pPr>
-              <w:rPr>
-                <w:rFonts w:ascii="Arial" w:hAnsi="Arial" w:cs="Arial"/>
-              </w:rPr>
-            </w:pPr>
-            <w:r>
-              <w:rPr>
-                <w:sz w:val="12"/>
-              </w:rPr>
-              <w:t>{movilidad_extensiones_password_na}</w:t>
+            <w:vAlign w:val="bottom"/>
+          </w:tcPr>
+          <w:p>
+            <w:pPr>
+              <w:rPr>
+                <w:rFonts w:ascii="Arial" w:hAnsi="Arial" w:cs="Arial"/>
+              </w:rPr>
+            </w:pPr>
+            <w:r>
+              <w:rPr>
+                <w:sz w:val="12"/>
+              </w:rPr>
+              <w:t>{</w:t>
+            </w:r>
+            <w:proofErr w:type="spellStart"/>
+            <w:r>
+              <w:rPr>
+                <w:sz w:val="12"/>
+              </w:rPr>
+              <w:t>movilidad_extensiones_password_na</w:t>
+            </w:r>
+            <w:proofErr w:type="spellEnd"/>
+            <w:r>
+              <w:rPr>
+                <w:sz w:val="12"/>
+              </w:rPr>
+              <w:t>}</w:t>
             </w:r>
           </w:p>
         </w:tc>
@@ -3876,7 +4052,6 @@
               <w:bottom w:val="single" w:sz="4" w:space="0" w:color="auto"/>
               <w:right w:val="single" w:sz="4" w:space="0" w:color="auto"/>
             </w:tcBorders>
-            <w:shd w:val="clear" w:color="auto" w:fill="auto"/>
             <w:noWrap/>
             <w:vAlign w:val="bottom"/>
           </w:tcPr>
@@ -3891,7 +4066,21 @@
               <w:rPr>
                 <w:sz w:val="12"/>
               </w:rPr>
-              <w:t>{rotacion_llamada_grupos_si}</w:t>
+              <w:t>{</w:t>
+            </w:r>
+            <w:proofErr w:type="spellStart"/>
+            <w:r>
+              <w:rPr>
+                <w:sz w:val="12"/>
+              </w:rPr>
+              <w:t>rotacion_llamada_grupos_si</w:t>
+            </w:r>
+            <w:proofErr w:type="spellEnd"/>
+            <w:r>
+              <w:rPr>
+                <w:sz w:val="12"/>
+              </w:rPr>
+              <w:t>}</w:t>
             </w:r>
           </w:p>
         </w:tc>
@@ -3933,7 +4122,6 @@
               <w:bottom w:val="single" w:sz="4" w:space="0" w:color="auto"/>
               <w:right w:val="single" w:sz="4" w:space="0" w:color="auto"/>
             </w:tcBorders>
-            <w:shd w:val="clear" w:color="auto" w:fill="auto"/>
             <w:noWrap/>
             <w:vAlign w:val="bottom"/>
           </w:tcPr>
@@ -3947,7 +4135,21 @@
               <w:rPr>
                 <w:sz w:val="12"/>
               </w:rPr>
-              <w:t>{rotacion_llamada_grupos_no}</w:t>
+              <w:t>{</w:t>
+            </w:r>
+            <w:proofErr w:type="spellStart"/>
+            <w:r>
+              <w:rPr>
+                <w:sz w:val="12"/>
+              </w:rPr>
+              <w:t>rotacion_llamada_grupos_no</w:t>
+            </w:r>
+            <w:proofErr w:type="spellEnd"/>
+            <w:r>
+              <w:rPr>
+                <w:sz w:val="12"/>
+              </w:rPr>
+              <w:t>}</w:t>
             </w:r>
           </w:p>
         </w:tc>
@@ -3986,20 +4188,33 @@
               <w:bottom w:val="single" w:sz="4" w:space="0" w:color="auto"/>
               <w:right w:val="single" w:sz="4" w:space="0" w:color="auto"/>
             </w:tcBorders>
-            <w:shd w:val="clear" w:color="auto" w:fill="auto"/>
-            <w:vAlign w:val="bottom"/>
-          </w:tcPr>
-          <w:p>
-            <w:pPr>
-              <w:rPr>
-                <w:rFonts w:ascii="Arial" w:hAnsi="Arial" w:cs="Arial"/>
-              </w:rPr>
-            </w:pPr>
-            <w:r>
-              <w:rPr>
-                <w:sz w:val="12"/>
-              </w:rPr>
-              <w:t>{rotacion_llamada_grupos_na}</w:t>
+            <w:vAlign w:val="bottom"/>
+          </w:tcPr>
+          <w:p>
+            <w:pPr>
+              <w:rPr>
+                <w:rFonts w:ascii="Arial" w:hAnsi="Arial" w:cs="Arial"/>
+              </w:rPr>
+            </w:pPr>
+            <w:r>
+              <w:rPr>
+                <w:sz w:val="12"/>
+              </w:rPr>
+              <w:t>{</w:t>
+            </w:r>
+            <w:proofErr w:type="spellStart"/>
+            <w:r>
+              <w:rPr>
+                <w:sz w:val="12"/>
+              </w:rPr>
+              <w:t>rotacion_llamada_grupos_na</w:t>
+            </w:r>
+            <w:proofErr w:type="spellEnd"/>
+            <w:r>
+              <w:rPr>
+                <w:sz w:val="12"/>
+              </w:rPr>
+              <w:t>}</w:t>
             </w:r>
           </w:p>
         </w:tc>
@@ -4135,7 +4350,6 @@
               <w:bottom w:val="single" w:sz="4" w:space="0" w:color="auto"/>
               <w:right w:val="single" w:sz="4" w:space="0" w:color="auto"/>
             </w:tcBorders>
-            <w:shd w:val="clear" w:color="auto" w:fill="auto"/>
             <w:noWrap/>
             <w:vAlign w:val="bottom"/>
           </w:tcPr>
@@ -4150,7 +4364,21 @@
               <w:rPr>
                 <w:sz w:val="12"/>
               </w:rPr>
-              <w:t>{identificador_llamadas_si}</w:t>
+              <w:t>{</w:t>
+            </w:r>
+            <w:proofErr w:type="spellStart"/>
+            <w:r>
+              <w:rPr>
+                <w:sz w:val="12"/>
+              </w:rPr>
+              <w:t>identificador_llamadas_si</w:t>
+            </w:r>
+            <w:proofErr w:type="spellEnd"/>
+            <w:r>
+              <w:rPr>
+                <w:sz w:val="12"/>
+              </w:rPr>
+              <w:t>}</w:t>
             </w:r>
           </w:p>
         </w:tc>
@@ -4192,7 +4420,6 @@
               <w:bottom w:val="single" w:sz="4" w:space="0" w:color="auto"/>
               <w:right w:val="single" w:sz="4" w:space="0" w:color="auto"/>
             </w:tcBorders>
-            <w:shd w:val="clear" w:color="auto" w:fill="auto"/>
             <w:noWrap/>
             <w:vAlign w:val="bottom"/>
           </w:tcPr>
@@ -4206,7 +4433,21 @@
               <w:rPr>
                 <w:sz w:val="12"/>
               </w:rPr>
-              <w:t>{identificador_llamadas_no}</w:t>
+              <w:t>{</w:t>
+            </w:r>
+            <w:proofErr w:type="spellStart"/>
+            <w:r>
+              <w:rPr>
+                <w:sz w:val="12"/>
+              </w:rPr>
+              <w:t>identificador_llamadas_no</w:t>
+            </w:r>
+            <w:proofErr w:type="spellEnd"/>
+            <w:r>
+              <w:rPr>
+                <w:sz w:val="12"/>
+              </w:rPr>
+              <w:t>}</w:t>
             </w:r>
           </w:p>
         </w:tc>
@@ -4245,20 +4486,33 @@
               <w:bottom w:val="single" w:sz="4" w:space="0" w:color="auto"/>
               <w:right w:val="single" w:sz="4" w:space="0" w:color="auto"/>
             </w:tcBorders>
-            <w:shd w:val="clear" w:color="auto" w:fill="auto"/>
-            <w:vAlign w:val="bottom"/>
-          </w:tcPr>
-          <w:p>
-            <w:pPr>
-              <w:rPr>
-                <w:rFonts w:ascii="Arial" w:hAnsi="Arial" w:cs="Arial"/>
-              </w:rPr>
-            </w:pPr>
-            <w:r>
-              <w:rPr>
-                <w:sz w:val="12"/>
-              </w:rPr>
-              <w:t>{identificador_llamadas_na}</w:t>
+            <w:vAlign w:val="bottom"/>
+          </w:tcPr>
+          <w:p>
+            <w:pPr>
+              <w:rPr>
+                <w:rFonts w:ascii="Arial" w:hAnsi="Arial" w:cs="Arial"/>
+              </w:rPr>
+            </w:pPr>
+            <w:r>
+              <w:rPr>
+                <w:sz w:val="12"/>
+              </w:rPr>
+              <w:t>{</w:t>
+            </w:r>
+            <w:proofErr w:type="spellStart"/>
+            <w:r>
+              <w:rPr>
+                <w:sz w:val="12"/>
+              </w:rPr>
+              <w:t>identificador_llamadas_na</w:t>
+            </w:r>
+            <w:proofErr w:type="spellEnd"/>
+            <w:r>
+              <w:rPr>
+                <w:sz w:val="12"/>
+              </w:rPr>
+              <w:t>}</w:t>
             </w:r>
           </w:p>
         </w:tc>
@@ -4369,7 +4623,6 @@
               <w:bottom w:val="single" w:sz="4" w:space="0" w:color="auto"/>
               <w:right w:val="single" w:sz="4" w:space="0" w:color="auto"/>
             </w:tcBorders>
-            <w:shd w:val="clear" w:color="auto" w:fill="auto"/>
             <w:noWrap/>
             <w:vAlign w:val="bottom"/>
           </w:tcPr>
@@ -4384,7 +4637,21 @@
               <w:rPr>
                 <w:sz w:val="12"/>
               </w:rPr>
-              <w:t>{llamada_espera_si}</w:t>
+              <w:t>{</w:t>
+            </w:r>
+            <w:proofErr w:type="spellStart"/>
+            <w:r>
+              <w:rPr>
+                <w:sz w:val="12"/>
+              </w:rPr>
+              <w:t>llamada_espera_si</w:t>
+            </w:r>
+            <w:proofErr w:type="spellEnd"/>
+            <w:r>
+              <w:rPr>
+                <w:sz w:val="12"/>
+              </w:rPr>
+              <w:t>}</w:t>
             </w:r>
           </w:p>
         </w:tc>
@@ -4426,7 +4693,6 @@
               <w:bottom w:val="single" w:sz="4" w:space="0" w:color="auto"/>
               <w:right w:val="single" w:sz="4" w:space="0" w:color="auto"/>
             </w:tcBorders>
-            <w:shd w:val="clear" w:color="auto" w:fill="auto"/>
             <w:noWrap/>
             <w:vAlign w:val="bottom"/>
           </w:tcPr>
@@ -4440,7 +4706,21 @@
               <w:rPr>
                 <w:sz w:val="12"/>
               </w:rPr>
-              <w:t>{llamada_espera_no}</w:t>
+              <w:t>{</w:t>
+            </w:r>
+            <w:proofErr w:type="spellStart"/>
+            <w:r>
+              <w:rPr>
+                <w:sz w:val="12"/>
+              </w:rPr>
+              <w:t>llamada_espera_no</w:t>
+            </w:r>
+            <w:proofErr w:type="spellEnd"/>
+            <w:r>
+              <w:rPr>
+                <w:sz w:val="12"/>
+              </w:rPr>
+              <w:t>}</w:t>
             </w:r>
           </w:p>
         </w:tc>
@@ -4479,20 +4759,33 @@
               <w:bottom w:val="single" w:sz="4" w:space="0" w:color="auto"/>
               <w:right w:val="single" w:sz="4" w:space="0" w:color="auto"/>
             </w:tcBorders>
-            <w:shd w:val="clear" w:color="auto" w:fill="auto"/>
-            <w:vAlign w:val="bottom"/>
-          </w:tcPr>
-          <w:p>
-            <w:pPr>
-              <w:rPr>
-                <w:rFonts w:ascii="Arial" w:hAnsi="Arial" w:cs="Arial"/>
-              </w:rPr>
-            </w:pPr>
-            <w:r>
-              <w:rPr>
-                <w:sz w:val="12"/>
-              </w:rPr>
-              <w:t>{llamada_espera_na}</w:t>
+            <w:vAlign w:val="bottom"/>
+          </w:tcPr>
+          <w:p>
+            <w:pPr>
+              <w:rPr>
+                <w:rFonts w:ascii="Arial" w:hAnsi="Arial" w:cs="Arial"/>
+              </w:rPr>
+            </w:pPr>
+            <w:r>
+              <w:rPr>
+                <w:sz w:val="12"/>
+              </w:rPr>
+              <w:t>{</w:t>
+            </w:r>
+            <w:proofErr w:type="spellStart"/>
+            <w:r>
+              <w:rPr>
+                <w:sz w:val="12"/>
+              </w:rPr>
+              <w:t>llamada_espera_na</w:t>
+            </w:r>
+            <w:proofErr w:type="spellEnd"/>
+            <w:r>
+              <w:rPr>
+                <w:sz w:val="12"/>
+              </w:rPr>
+              <w:t>}</w:t>
             </w:r>
           </w:p>
         </w:tc>
@@ -4604,7 +4897,6 @@
               <w:bottom w:val="single" w:sz="4" w:space="0" w:color="auto"/>
               <w:right w:val="single" w:sz="4" w:space="0" w:color="auto"/>
             </w:tcBorders>
-            <w:shd w:val="clear" w:color="auto" w:fill="auto"/>
             <w:noWrap/>
             <w:vAlign w:val="bottom"/>
           </w:tcPr>
@@ -4619,7 +4911,21 @@
               <w:rPr>
                 <w:sz w:val="12"/>
               </w:rPr>
-              <w:t>{musica_espera_corporativa_si}</w:t>
+              <w:t>{</w:t>
+            </w:r>
+            <w:proofErr w:type="spellStart"/>
+            <w:r>
+              <w:rPr>
+                <w:sz w:val="12"/>
+              </w:rPr>
+              <w:t>musica_espera_corporativa_si</w:t>
+            </w:r>
+            <w:proofErr w:type="spellEnd"/>
+            <w:r>
+              <w:rPr>
+                <w:sz w:val="12"/>
+              </w:rPr>
+              <w:t>}</w:t>
             </w:r>
           </w:p>
         </w:tc>
@@ -4661,7 +4967,6 @@
               <w:bottom w:val="single" w:sz="4" w:space="0" w:color="auto"/>
               <w:right w:val="single" w:sz="4" w:space="0" w:color="auto"/>
             </w:tcBorders>
-            <w:shd w:val="clear" w:color="auto" w:fill="auto"/>
             <w:noWrap/>
             <w:vAlign w:val="bottom"/>
           </w:tcPr>
@@ -4675,7 +4980,21 @@
               <w:rPr>
                 <w:sz w:val="12"/>
               </w:rPr>
-              <w:t>{musica_espera_corporativa_no}</w:t>
+              <w:t>{</w:t>
+            </w:r>
+            <w:proofErr w:type="spellStart"/>
+            <w:r>
+              <w:rPr>
+                <w:sz w:val="12"/>
+              </w:rPr>
+              <w:t>musica_espera_corporativa_no</w:t>
+            </w:r>
+            <w:proofErr w:type="spellEnd"/>
+            <w:r>
+              <w:rPr>
+                <w:sz w:val="12"/>
+              </w:rPr>
+              <w:t>}</w:t>
             </w:r>
           </w:p>
         </w:tc>
@@ -4714,20 +5033,33 @@
               <w:bottom w:val="single" w:sz="4" w:space="0" w:color="auto"/>
               <w:right w:val="single" w:sz="4" w:space="0" w:color="auto"/>
             </w:tcBorders>
-            <w:shd w:val="clear" w:color="auto" w:fill="auto"/>
-            <w:vAlign w:val="bottom"/>
-          </w:tcPr>
-          <w:p>
-            <w:pPr>
-              <w:rPr>
-                <w:rFonts w:ascii="Arial" w:hAnsi="Arial" w:cs="Arial"/>
-              </w:rPr>
-            </w:pPr>
-            <w:r>
-              <w:rPr>
-                <w:sz w:val="12"/>
-              </w:rPr>
-              <w:t>{musica_espera_corporativa_na}</w:t>
+            <w:vAlign w:val="bottom"/>
+          </w:tcPr>
+          <w:p>
+            <w:pPr>
+              <w:rPr>
+                <w:rFonts w:ascii="Arial" w:hAnsi="Arial" w:cs="Arial"/>
+              </w:rPr>
+            </w:pPr>
+            <w:r>
+              <w:rPr>
+                <w:sz w:val="12"/>
+              </w:rPr>
+              <w:t>{</w:t>
+            </w:r>
+            <w:proofErr w:type="spellStart"/>
+            <w:r>
+              <w:rPr>
+                <w:sz w:val="12"/>
+              </w:rPr>
+              <w:t>musica_espera_corporativa_na</w:t>
+            </w:r>
+            <w:proofErr w:type="spellEnd"/>
+            <w:r>
+              <w:rPr>
+                <w:sz w:val="12"/>
+              </w:rPr>
+              <w:t>}</w:t>
             </w:r>
           </w:p>
         </w:tc>
@@ -4831,7 +5163,6 @@
               <w:bottom w:val="single" w:sz="4" w:space="0" w:color="auto"/>
               <w:right w:val="single" w:sz="4" w:space="0" w:color="auto"/>
             </w:tcBorders>
-            <w:shd w:val="clear" w:color="auto" w:fill="auto"/>
             <w:noWrap/>
             <w:vAlign w:val="bottom"/>
           </w:tcPr>
@@ -4846,7 +5177,21 @@
               <w:rPr>
                 <w:sz w:val="12"/>
               </w:rPr>
-              <w:t>{transferencia_llamadas_si}</w:t>
+              <w:t>{</w:t>
+            </w:r>
+            <w:proofErr w:type="spellStart"/>
+            <w:r>
+              <w:rPr>
+                <w:sz w:val="12"/>
+              </w:rPr>
+              <w:t>transferencia_llamadas_si</w:t>
+            </w:r>
+            <w:proofErr w:type="spellEnd"/>
+            <w:r>
+              <w:rPr>
+                <w:sz w:val="12"/>
+              </w:rPr>
+              <w:t>}</w:t>
             </w:r>
           </w:p>
         </w:tc>
@@ -4888,7 +5233,6 @@
               <w:bottom w:val="single" w:sz="4" w:space="0" w:color="auto"/>
               <w:right w:val="single" w:sz="4" w:space="0" w:color="auto"/>
             </w:tcBorders>
-            <w:shd w:val="clear" w:color="auto" w:fill="auto"/>
             <w:noWrap/>
             <w:vAlign w:val="bottom"/>
           </w:tcPr>
@@ -4902,7 +5246,21 @@
               <w:rPr>
                 <w:sz w:val="12"/>
               </w:rPr>
-              <w:t>{transferencia_llamadas_no}</w:t>
+              <w:t>{</w:t>
+            </w:r>
+            <w:proofErr w:type="spellStart"/>
+            <w:r>
+              <w:rPr>
+                <w:sz w:val="12"/>
+              </w:rPr>
+              <w:t>transferencia_llamadas_no</w:t>
+            </w:r>
+            <w:proofErr w:type="spellEnd"/>
+            <w:r>
+              <w:rPr>
+                <w:sz w:val="12"/>
+              </w:rPr>
+              <w:t>}</w:t>
             </w:r>
           </w:p>
         </w:tc>
@@ -4941,20 +5299,33 @@
               <w:bottom w:val="single" w:sz="4" w:space="0" w:color="auto"/>
               <w:right w:val="single" w:sz="4" w:space="0" w:color="auto"/>
             </w:tcBorders>
-            <w:shd w:val="clear" w:color="auto" w:fill="auto"/>
-            <w:vAlign w:val="bottom"/>
-          </w:tcPr>
-          <w:p>
-            <w:pPr>
-              <w:rPr>
-                <w:rFonts w:ascii="Arial" w:hAnsi="Arial" w:cs="Arial"/>
-              </w:rPr>
-            </w:pPr>
-            <w:r>
-              <w:rPr>
-                <w:sz w:val="12"/>
-              </w:rPr>
-              <w:t>{transferencia_llamadas_na}</w:t>
+            <w:vAlign w:val="bottom"/>
+          </w:tcPr>
+          <w:p>
+            <w:pPr>
+              <w:rPr>
+                <w:rFonts w:ascii="Arial" w:hAnsi="Arial" w:cs="Arial"/>
+              </w:rPr>
+            </w:pPr>
+            <w:r>
+              <w:rPr>
+                <w:sz w:val="12"/>
+              </w:rPr>
+              <w:t>{</w:t>
+            </w:r>
+            <w:proofErr w:type="spellStart"/>
+            <w:r>
+              <w:rPr>
+                <w:sz w:val="12"/>
+              </w:rPr>
+              <w:t>transferencia_llamadas_na</w:t>
+            </w:r>
+            <w:proofErr w:type="spellEnd"/>
+            <w:r>
+              <w:rPr>
+                <w:sz w:val="12"/>
+              </w:rPr>
+              <w:t>}</w:t>
             </w:r>
           </w:p>
         </w:tc>
@@ -5065,7 +5436,6 @@
               <w:bottom w:val="single" w:sz="4" w:space="0" w:color="auto"/>
               <w:right w:val="single" w:sz="4" w:space="0" w:color="auto"/>
             </w:tcBorders>
-            <w:shd w:val="clear" w:color="auto" w:fill="auto"/>
             <w:noWrap/>
             <w:vAlign w:val="bottom"/>
           </w:tcPr>
@@ -5080,7 +5450,21 @@
               <w:rPr>
                 <w:sz w:val="12"/>
               </w:rPr>
-              <w:t>{conferencia_si}</w:t>
+              <w:t>{</w:t>
+            </w:r>
+            <w:proofErr w:type="spellStart"/>
+            <w:r>
+              <w:rPr>
+                <w:sz w:val="12"/>
+              </w:rPr>
+              <w:t>conferencia_si</w:t>
+            </w:r>
+            <w:proofErr w:type="spellEnd"/>
+            <w:r>
+              <w:rPr>
+                <w:sz w:val="12"/>
+              </w:rPr>
+              <w:t>}</w:t>
             </w:r>
           </w:p>
         </w:tc>
@@ -5122,7 +5506,6 @@
               <w:bottom w:val="single" w:sz="4" w:space="0" w:color="auto"/>
               <w:right w:val="single" w:sz="4" w:space="0" w:color="auto"/>
             </w:tcBorders>
-            <w:shd w:val="clear" w:color="auto" w:fill="auto"/>
             <w:noWrap/>
             <w:vAlign w:val="bottom"/>
           </w:tcPr>
@@ -5136,7 +5519,21 @@
               <w:rPr>
                 <w:sz w:val="12"/>
               </w:rPr>
-              <w:t>{conferencia_no}</w:t>
+              <w:t>{</w:t>
+            </w:r>
+            <w:proofErr w:type="spellStart"/>
+            <w:r>
+              <w:rPr>
+                <w:sz w:val="12"/>
+              </w:rPr>
+              <w:t>conferencia_no</w:t>
+            </w:r>
+            <w:proofErr w:type="spellEnd"/>
+            <w:r>
+              <w:rPr>
+                <w:sz w:val="12"/>
+              </w:rPr>
+              <w:t>}</w:t>
             </w:r>
           </w:p>
         </w:tc>
@@ -5175,20 +5572,33 @@
               <w:bottom w:val="single" w:sz="4" w:space="0" w:color="auto"/>
               <w:right w:val="single" w:sz="4" w:space="0" w:color="auto"/>
             </w:tcBorders>
-            <w:shd w:val="clear" w:color="auto" w:fill="auto"/>
-            <w:vAlign w:val="bottom"/>
-          </w:tcPr>
-          <w:p>
-            <w:pPr>
-              <w:rPr>
-                <w:rFonts w:ascii="Arial" w:hAnsi="Arial" w:cs="Arial"/>
-              </w:rPr>
-            </w:pPr>
-            <w:r>
-              <w:rPr>
-                <w:sz w:val="12"/>
-              </w:rPr>
-              <w:t>{conferencia_na}</w:t>
+            <w:vAlign w:val="bottom"/>
+          </w:tcPr>
+          <w:p>
+            <w:pPr>
+              <w:rPr>
+                <w:rFonts w:ascii="Arial" w:hAnsi="Arial" w:cs="Arial"/>
+              </w:rPr>
+            </w:pPr>
+            <w:r>
+              <w:rPr>
+                <w:sz w:val="12"/>
+              </w:rPr>
+              <w:t>{</w:t>
+            </w:r>
+            <w:proofErr w:type="spellStart"/>
+            <w:r>
+              <w:rPr>
+                <w:sz w:val="12"/>
+              </w:rPr>
+              <w:t>conferencia_na</w:t>
+            </w:r>
+            <w:proofErr w:type="spellEnd"/>
+            <w:r>
+              <w:rPr>
+                <w:sz w:val="12"/>
+              </w:rPr>
+              <w:t>}</w:t>
             </w:r>
           </w:p>
         </w:tc>
@@ -5290,7 +5700,6 @@
               <w:bottom w:val="single" w:sz="4" w:space="0" w:color="auto"/>
               <w:right w:val="single" w:sz="4" w:space="0" w:color="auto"/>
             </w:tcBorders>
-            <w:shd w:val="clear" w:color="auto" w:fill="auto"/>
             <w:noWrap/>
             <w:vAlign w:val="bottom"/>
           </w:tcPr>
@@ -5305,7 +5714,21 @@
               <w:rPr>
                 <w:sz w:val="12"/>
               </w:rPr>
-              <w:t>{conexion_dos_llamadas_conferencia_si}</w:t>
+              <w:t>{</w:t>
+            </w:r>
+            <w:proofErr w:type="spellStart"/>
+            <w:r>
+              <w:rPr>
+                <w:sz w:val="12"/>
+              </w:rPr>
+              <w:t>conexion_dos_llamadas_conferencia_si</w:t>
+            </w:r>
+            <w:proofErr w:type="spellEnd"/>
+            <w:r>
+              <w:rPr>
+                <w:sz w:val="12"/>
+              </w:rPr>
+              <w:t>}</w:t>
             </w:r>
           </w:p>
         </w:tc>
@@ -5347,7 +5770,6 @@
               <w:bottom w:val="single" w:sz="4" w:space="0" w:color="auto"/>
               <w:right w:val="single" w:sz="4" w:space="0" w:color="auto"/>
             </w:tcBorders>
-            <w:shd w:val="clear" w:color="auto" w:fill="auto"/>
             <w:noWrap/>
             <w:vAlign w:val="bottom"/>
           </w:tcPr>
@@ -5361,7 +5783,21 @@
               <w:rPr>
                 <w:sz w:val="12"/>
               </w:rPr>
-              <w:t>{conexion_dos_llamadas_conferencia_no}</w:t>
+              <w:t>{</w:t>
+            </w:r>
+            <w:proofErr w:type="spellStart"/>
+            <w:r>
+              <w:rPr>
+                <w:sz w:val="12"/>
+              </w:rPr>
+              <w:t>conexion_dos_llamadas_conferencia_no</w:t>
+            </w:r>
+            <w:proofErr w:type="spellEnd"/>
+            <w:r>
+              <w:rPr>
+                <w:sz w:val="12"/>
+              </w:rPr>
+              <w:t>}</w:t>
             </w:r>
           </w:p>
         </w:tc>
@@ -5400,20 +5836,33 @@
               <w:bottom w:val="single" w:sz="4" w:space="0" w:color="auto"/>
               <w:right w:val="single" w:sz="4" w:space="0" w:color="auto"/>
             </w:tcBorders>
-            <w:shd w:val="clear" w:color="auto" w:fill="auto"/>
-            <w:vAlign w:val="bottom"/>
-          </w:tcPr>
-          <w:p>
-            <w:pPr>
-              <w:rPr>
-                <w:rFonts w:ascii="Arial" w:hAnsi="Arial" w:cs="Arial"/>
-              </w:rPr>
-            </w:pPr>
-            <w:r>
-              <w:rPr>
-                <w:sz w:val="12"/>
-              </w:rPr>
-              <w:t>{conexion_dos_llamadas_conferencia_na}</w:t>
+            <w:vAlign w:val="bottom"/>
+          </w:tcPr>
+          <w:p>
+            <w:pPr>
+              <w:rPr>
+                <w:rFonts w:ascii="Arial" w:hAnsi="Arial" w:cs="Arial"/>
+              </w:rPr>
+            </w:pPr>
+            <w:r>
+              <w:rPr>
+                <w:sz w:val="12"/>
+              </w:rPr>
+              <w:t>{</w:t>
+            </w:r>
+            <w:proofErr w:type="spellStart"/>
+            <w:r>
+              <w:rPr>
+                <w:sz w:val="12"/>
+              </w:rPr>
+              <w:t>conexion_dos_llamadas_conferencia_na</w:t>
+            </w:r>
+            <w:proofErr w:type="spellEnd"/>
+            <w:r>
+              <w:rPr>
+                <w:sz w:val="12"/>
+              </w:rPr>
+              <w:t>}</w:t>
             </w:r>
           </w:p>
         </w:tc>
@@ -5525,7 +5974,6 @@
               <w:bottom w:val="single" w:sz="4" w:space="0" w:color="auto"/>
               <w:right w:val="single" w:sz="4" w:space="0" w:color="auto"/>
             </w:tcBorders>
-            <w:shd w:val="clear" w:color="auto" w:fill="auto"/>
             <w:noWrap/>
             <w:vAlign w:val="bottom"/>
           </w:tcPr>
@@ -5540,7 +5988,21 @@
               <w:rPr>
                 <w:sz w:val="12"/>
               </w:rPr>
-              <w:t>{rellamada_si}</w:t>
+              <w:t>{</w:t>
+            </w:r>
+            <w:proofErr w:type="spellStart"/>
+            <w:r>
+              <w:rPr>
+                <w:sz w:val="12"/>
+              </w:rPr>
+              <w:t>rellamada_si</w:t>
+            </w:r>
+            <w:proofErr w:type="spellEnd"/>
+            <w:r>
+              <w:rPr>
+                <w:sz w:val="12"/>
+              </w:rPr>
+              <w:t>}</w:t>
             </w:r>
           </w:p>
         </w:tc>
@@ -5582,7 +6044,6 @@
               <w:bottom w:val="single" w:sz="4" w:space="0" w:color="auto"/>
               <w:right w:val="single" w:sz="4" w:space="0" w:color="auto"/>
             </w:tcBorders>
-            <w:shd w:val="clear" w:color="auto" w:fill="auto"/>
             <w:noWrap/>
             <w:vAlign w:val="bottom"/>
           </w:tcPr>
@@ -5596,7 +6057,21 @@
               <w:rPr>
                 <w:sz w:val="12"/>
               </w:rPr>
-              <w:t>{rellamada_no}</w:t>
+              <w:t>{</w:t>
+            </w:r>
+            <w:proofErr w:type="spellStart"/>
+            <w:r>
+              <w:rPr>
+                <w:sz w:val="12"/>
+              </w:rPr>
+              <w:t>rellamada_no</w:t>
+            </w:r>
+            <w:proofErr w:type="spellEnd"/>
+            <w:r>
+              <w:rPr>
+                <w:sz w:val="12"/>
+              </w:rPr>
+              <w:t>}</w:t>
             </w:r>
           </w:p>
         </w:tc>
@@ -5635,20 +6110,33 @@
               <w:bottom w:val="single" w:sz="4" w:space="0" w:color="auto"/>
               <w:right w:val="single" w:sz="4" w:space="0" w:color="auto"/>
             </w:tcBorders>
-            <w:shd w:val="clear" w:color="auto" w:fill="auto"/>
-            <w:vAlign w:val="bottom"/>
-          </w:tcPr>
-          <w:p>
-            <w:pPr>
-              <w:rPr>
-                <w:rFonts w:ascii="Arial" w:hAnsi="Arial" w:cs="Arial"/>
-              </w:rPr>
-            </w:pPr>
-            <w:r>
-              <w:rPr>
-                <w:sz w:val="12"/>
-              </w:rPr>
-              <w:t>{rellamada_na}</w:t>
+            <w:vAlign w:val="bottom"/>
+          </w:tcPr>
+          <w:p>
+            <w:pPr>
+              <w:rPr>
+                <w:rFonts w:ascii="Arial" w:hAnsi="Arial" w:cs="Arial"/>
+              </w:rPr>
+            </w:pPr>
+            <w:r>
+              <w:rPr>
+                <w:sz w:val="12"/>
+              </w:rPr>
+              <w:t>{</w:t>
+            </w:r>
+            <w:proofErr w:type="spellStart"/>
+            <w:r>
+              <w:rPr>
+                <w:sz w:val="12"/>
+              </w:rPr>
+              <w:t>rellamada_na</w:t>
+            </w:r>
+            <w:proofErr w:type="spellEnd"/>
+            <w:r>
+              <w:rPr>
+                <w:sz w:val="12"/>
+              </w:rPr>
+              <w:t>}</w:t>
             </w:r>
           </w:p>
         </w:tc>
@@ -5758,7 +6246,6 @@
               <w:bottom w:val="single" w:sz="4" w:space="0" w:color="auto"/>
               <w:right w:val="single" w:sz="4" w:space="0" w:color="auto"/>
             </w:tcBorders>
-            <w:shd w:val="clear" w:color="auto" w:fill="auto"/>
             <w:noWrap/>
             <w:vAlign w:val="bottom"/>
           </w:tcPr>
@@ -5773,7 +6260,21 @@
               <w:rPr>
                 <w:sz w:val="12"/>
               </w:rPr>
-              <w:t>{desvio_llamadas_si}</w:t>
+              <w:t>{</w:t>
+            </w:r>
+            <w:proofErr w:type="spellStart"/>
+            <w:r>
+              <w:rPr>
+                <w:sz w:val="12"/>
+              </w:rPr>
+              <w:t>desvio_llamadas_si</w:t>
+            </w:r>
+            <w:proofErr w:type="spellEnd"/>
+            <w:r>
+              <w:rPr>
+                <w:sz w:val="12"/>
+              </w:rPr>
+              <w:t>}</w:t>
             </w:r>
           </w:p>
         </w:tc>
@@ -5815,7 +6316,6 @@
               <w:bottom w:val="single" w:sz="4" w:space="0" w:color="auto"/>
               <w:right w:val="single" w:sz="4" w:space="0" w:color="auto"/>
             </w:tcBorders>
-            <w:shd w:val="clear" w:color="auto" w:fill="auto"/>
             <w:noWrap/>
             <w:vAlign w:val="bottom"/>
           </w:tcPr>
@@ -5829,7 +6329,21 @@
               <w:rPr>
                 <w:sz w:val="12"/>
               </w:rPr>
-              <w:t>{desvio_llamadas_no}</w:t>
+              <w:t>{</w:t>
+            </w:r>
+            <w:proofErr w:type="spellStart"/>
+            <w:r>
+              <w:rPr>
+                <w:sz w:val="12"/>
+              </w:rPr>
+              <w:t>desvio_llamadas_no</w:t>
+            </w:r>
+            <w:proofErr w:type="spellEnd"/>
+            <w:r>
+              <w:rPr>
+                <w:sz w:val="12"/>
+              </w:rPr>
+              <w:t>}</w:t>
             </w:r>
           </w:p>
         </w:tc>
@@ -5868,20 +6382,33 @@
               <w:bottom w:val="single" w:sz="4" w:space="0" w:color="auto"/>
               <w:right w:val="single" w:sz="4" w:space="0" w:color="auto"/>
             </w:tcBorders>
-            <w:shd w:val="clear" w:color="auto" w:fill="auto"/>
-            <w:vAlign w:val="bottom"/>
-          </w:tcPr>
-          <w:p>
-            <w:pPr>
-              <w:rPr>
-                <w:rFonts w:ascii="Arial" w:hAnsi="Arial" w:cs="Arial"/>
-              </w:rPr>
-            </w:pPr>
-            <w:r>
-              <w:rPr>
-                <w:sz w:val="12"/>
-              </w:rPr>
-              <w:t>{desvio_llamadas_na}</w:t>
+            <w:vAlign w:val="bottom"/>
+          </w:tcPr>
+          <w:p>
+            <w:pPr>
+              <w:rPr>
+                <w:rFonts w:ascii="Arial" w:hAnsi="Arial" w:cs="Arial"/>
+              </w:rPr>
+            </w:pPr>
+            <w:r>
+              <w:rPr>
+                <w:sz w:val="12"/>
+              </w:rPr>
+              <w:t>{</w:t>
+            </w:r>
+            <w:proofErr w:type="spellStart"/>
+            <w:r>
+              <w:rPr>
+                <w:sz w:val="12"/>
+              </w:rPr>
+              <w:t>desvio_llamadas_na</w:t>
+            </w:r>
+            <w:proofErr w:type="spellEnd"/>
+            <w:r>
+              <w:rPr>
+                <w:sz w:val="12"/>
+              </w:rPr>
+              <w:t>}</w:t>
             </w:r>
           </w:p>
         </w:tc>
@@ -5982,7 +6509,6 @@
               <w:bottom w:val="single" w:sz="4" w:space="0" w:color="auto"/>
               <w:right w:val="single" w:sz="4" w:space="0" w:color="auto"/>
             </w:tcBorders>
-            <w:shd w:val="clear" w:color="auto" w:fill="auto"/>
             <w:noWrap/>
             <w:vAlign w:val="bottom"/>
           </w:tcPr>
@@ -5997,7 +6523,21 @@
               <w:rPr>
                 <w:sz w:val="12"/>
               </w:rPr>
-              <w:t>{marcado_rapido_gerente_subgerente_si}</w:t>
+              <w:t>{</w:t>
+            </w:r>
+            <w:proofErr w:type="spellStart"/>
+            <w:r>
+              <w:rPr>
+                <w:sz w:val="12"/>
+              </w:rPr>
+              <w:t>marcado_rapido_gerente_subgerente_si</w:t>
+            </w:r>
+            <w:proofErr w:type="spellEnd"/>
+            <w:r>
+              <w:rPr>
+                <w:sz w:val="12"/>
+              </w:rPr>
+              <w:t>}</w:t>
             </w:r>
           </w:p>
         </w:tc>
@@ -6039,7 +6579,6 @@
               <w:bottom w:val="single" w:sz="4" w:space="0" w:color="auto"/>
               <w:right w:val="single" w:sz="4" w:space="0" w:color="auto"/>
             </w:tcBorders>
-            <w:shd w:val="clear" w:color="auto" w:fill="auto"/>
             <w:noWrap/>
             <w:vAlign w:val="bottom"/>
           </w:tcPr>
@@ -6053,7 +6592,21 @@
               <w:rPr>
                 <w:sz w:val="12"/>
               </w:rPr>
-              <w:t>{marcado_rapido_gerente_subgerente_no}</w:t>
+              <w:t>{</w:t>
+            </w:r>
+            <w:proofErr w:type="spellStart"/>
+            <w:r>
+              <w:rPr>
+                <w:sz w:val="12"/>
+              </w:rPr>
+              <w:t>marcado_rapido_gerente_subgerente_no</w:t>
+            </w:r>
+            <w:proofErr w:type="spellEnd"/>
+            <w:r>
+              <w:rPr>
+                <w:sz w:val="12"/>
+              </w:rPr>
+              <w:t>}</w:t>
             </w:r>
           </w:p>
         </w:tc>
@@ -6092,20 +6645,33 @@
               <w:bottom w:val="single" w:sz="4" w:space="0" w:color="auto"/>
               <w:right w:val="single" w:sz="4" w:space="0" w:color="auto"/>
             </w:tcBorders>
-            <w:shd w:val="clear" w:color="auto" w:fill="auto"/>
-            <w:vAlign w:val="bottom"/>
-          </w:tcPr>
-          <w:p>
-            <w:pPr>
-              <w:rPr>
-                <w:rFonts w:ascii="Arial" w:hAnsi="Arial" w:cs="Arial"/>
-              </w:rPr>
-            </w:pPr>
-            <w:r>
-              <w:rPr>
-                <w:sz w:val="12"/>
-              </w:rPr>
-              <w:t>{marcado_rapido_gerente_subgerente_na}</w:t>
+            <w:vAlign w:val="bottom"/>
+          </w:tcPr>
+          <w:p>
+            <w:pPr>
+              <w:rPr>
+                <w:rFonts w:ascii="Arial" w:hAnsi="Arial" w:cs="Arial"/>
+              </w:rPr>
+            </w:pPr>
+            <w:r>
+              <w:rPr>
+                <w:sz w:val="12"/>
+              </w:rPr>
+              <w:t>{</w:t>
+            </w:r>
+            <w:proofErr w:type="spellStart"/>
+            <w:r>
+              <w:rPr>
+                <w:sz w:val="12"/>
+              </w:rPr>
+              <w:t>marcado_rapido_gerente_subgerente_na</w:t>
+            </w:r>
+            <w:proofErr w:type="spellEnd"/>
+            <w:r>
+              <w:rPr>
+                <w:sz w:val="12"/>
+              </w:rPr>
+              <w:t>}</w:t>
             </w:r>
           </w:p>
         </w:tc>
@@ -6206,7 +6772,6 @@
               <w:bottom w:val="single" w:sz="4" w:space="0" w:color="auto"/>
               <w:right w:val="single" w:sz="4" w:space="0" w:color="auto"/>
             </w:tcBorders>
-            <w:shd w:val="clear" w:color="auto" w:fill="auto"/>
             <w:noWrap/>
             <w:vAlign w:val="bottom"/>
           </w:tcPr>
@@ -6221,7 +6786,21 @@
               <w:rPr>
                 <w:sz w:val="12"/>
               </w:rPr>
-              <w:t>{restriccion_celular_si}</w:t>
+              <w:t>{</w:t>
+            </w:r>
+            <w:proofErr w:type="spellStart"/>
+            <w:r>
+              <w:rPr>
+                <w:sz w:val="12"/>
+              </w:rPr>
+              <w:t>restriccion_celular_si</w:t>
+            </w:r>
+            <w:proofErr w:type="spellEnd"/>
+            <w:r>
+              <w:rPr>
+                <w:sz w:val="12"/>
+              </w:rPr>
+              <w:t>}</w:t>
             </w:r>
           </w:p>
         </w:tc>
@@ -6263,7 +6842,6 @@
               <w:bottom w:val="single" w:sz="4" w:space="0" w:color="auto"/>
               <w:right w:val="single" w:sz="4" w:space="0" w:color="auto"/>
             </w:tcBorders>
-            <w:shd w:val="clear" w:color="auto" w:fill="auto"/>
             <w:noWrap/>
             <w:vAlign w:val="bottom"/>
           </w:tcPr>
@@ -6277,7 +6855,21 @@
               <w:rPr>
                 <w:sz w:val="12"/>
               </w:rPr>
-              <w:t>{restriccion_celular_no}</w:t>
+              <w:t>{</w:t>
+            </w:r>
+            <w:proofErr w:type="spellStart"/>
+            <w:r>
+              <w:rPr>
+                <w:sz w:val="12"/>
+              </w:rPr>
+              <w:t>restriccion_celular_no</w:t>
+            </w:r>
+            <w:proofErr w:type="spellEnd"/>
+            <w:r>
+              <w:rPr>
+                <w:sz w:val="12"/>
+              </w:rPr>
+              <w:t>}</w:t>
             </w:r>
           </w:p>
         </w:tc>
@@ -6316,20 +6908,33 @@
               <w:bottom w:val="single" w:sz="4" w:space="0" w:color="auto"/>
               <w:right w:val="single" w:sz="4" w:space="0" w:color="auto"/>
             </w:tcBorders>
-            <w:shd w:val="clear" w:color="auto" w:fill="auto"/>
-            <w:vAlign w:val="bottom"/>
-          </w:tcPr>
-          <w:p>
-            <w:pPr>
-              <w:rPr>
-                <w:rFonts w:ascii="Arial" w:hAnsi="Arial" w:cs="Arial"/>
-              </w:rPr>
-            </w:pPr>
-            <w:r>
-              <w:rPr>
-                <w:sz w:val="12"/>
-              </w:rPr>
-              <w:t>{restriccion_celular_na}</w:t>
+            <w:vAlign w:val="bottom"/>
+          </w:tcPr>
+          <w:p>
+            <w:pPr>
+              <w:rPr>
+                <w:rFonts w:ascii="Arial" w:hAnsi="Arial" w:cs="Arial"/>
+              </w:rPr>
+            </w:pPr>
+            <w:r>
+              <w:rPr>
+                <w:sz w:val="12"/>
+              </w:rPr>
+              <w:t>{</w:t>
+            </w:r>
+            <w:proofErr w:type="spellStart"/>
+            <w:r>
+              <w:rPr>
+                <w:sz w:val="12"/>
+              </w:rPr>
+              <w:t>restriccion_celular_na</w:t>
+            </w:r>
+            <w:proofErr w:type="spellEnd"/>
+            <w:r>
+              <w:rPr>
+                <w:sz w:val="12"/>
+              </w:rPr>
+              <w:t>}</w:t>
             </w:r>
           </w:p>
         </w:tc>
@@ -6430,7 +7035,6 @@
               <w:bottom w:val="single" w:sz="4" w:space="0" w:color="auto"/>
               <w:right w:val="single" w:sz="4" w:space="0" w:color="auto"/>
             </w:tcBorders>
-            <w:shd w:val="clear" w:color="auto" w:fill="auto"/>
             <w:noWrap/>
             <w:vAlign w:val="bottom"/>
           </w:tcPr>
@@ -6445,7 +7049,21 @@
               <w:rPr>
                 <w:sz w:val="12"/>
               </w:rPr>
-              <w:t>{restriccion_larga_distancia_nacional_si}</w:t>
+              <w:t>{</w:t>
+            </w:r>
+            <w:proofErr w:type="spellStart"/>
+            <w:r>
+              <w:rPr>
+                <w:sz w:val="12"/>
+              </w:rPr>
+              <w:t>restriccion_larga_distancia_nacional_si</w:t>
+            </w:r>
+            <w:proofErr w:type="spellEnd"/>
+            <w:r>
+              <w:rPr>
+                <w:sz w:val="12"/>
+              </w:rPr>
+              <w:t>}</w:t>
             </w:r>
           </w:p>
         </w:tc>
@@ -6487,7 +7105,6 @@
               <w:bottom w:val="single" w:sz="4" w:space="0" w:color="auto"/>
               <w:right w:val="single" w:sz="4" w:space="0" w:color="auto"/>
             </w:tcBorders>
-            <w:shd w:val="clear" w:color="auto" w:fill="auto"/>
             <w:noWrap/>
             <w:vAlign w:val="bottom"/>
           </w:tcPr>
@@ -6501,7 +7118,21 @@
               <w:rPr>
                 <w:sz w:val="12"/>
               </w:rPr>
-              <w:t>{restriccion_larga_distancia_nacional_no}</w:t>
+              <w:t>{</w:t>
+            </w:r>
+            <w:proofErr w:type="spellStart"/>
+            <w:r>
+              <w:rPr>
+                <w:sz w:val="12"/>
+              </w:rPr>
+              <w:t>restriccion_larga_distancia_nacional_no</w:t>
+            </w:r>
+            <w:proofErr w:type="spellEnd"/>
+            <w:r>
+              <w:rPr>
+                <w:sz w:val="12"/>
+              </w:rPr>
+              <w:t>}</w:t>
             </w:r>
           </w:p>
         </w:tc>
@@ -6540,20 +7171,33 @@
               <w:bottom w:val="single" w:sz="4" w:space="0" w:color="auto"/>
               <w:right w:val="single" w:sz="4" w:space="0" w:color="auto"/>
             </w:tcBorders>
-            <w:shd w:val="clear" w:color="auto" w:fill="auto"/>
-            <w:vAlign w:val="bottom"/>
-          </w:tcPr>
-          <w:p>
-            <w:pPr>
-              <w:rPr>
-                <w:rFonts w:ascii="Arial" w:hAnsi="Arial" w:cs="Arial"/>
-              </w:rPr>
-            </w:pPr>
-            <w:r>
-              <w:rPr>
-                <w:sz w:val="12"/>
-              </w:rPr>
-              <w:t>{restriccion_larga_distancia_nacional_na}</w:t>
+            <w:vAlign w:val="bottom"/>
+          </w:tcPr>
+          <w:p>
+            <w:pPr>
+              <w:rPr>
+                <w:rFonts w:ascii="Arial" w:hAnsi="Arial" w:cs="Arial"/>
+              </w:rPr>
+            </w:pPr>
+            <w:r>
+              <w:rPr>
+                <w:sz w:val="12"/>
+              </w:rPr>
+              <w:t>{</w:t>
+            </w:r>
+            <w:proofErr w:type="spellStart"/>
+            <w:r>
+              <w:rPr>
+                <w:sz w:val="12"/>
+              </w:rPr>
+              <w:t>restriccion_larga_distancia_nacional_na</w:t>
+            </w:r>
+            <w:proofErr w:type="spellEnd"/>
+            <w:r>
+              <w:rPr>
+                <w:sz w:val="12"/>
+              </w:rPr>
+              <w:t>}</w:t>
             </w:r>
           </w:p>
         </w:tc>
@@ -6664,7 +7308,6 @@
               <w:bottom w:val="single" w:sz="4" w:space="0" w:color="auto"/>
               <w:right w:val="single" w:sz="4" w:space="0" w:color="auto"/>
             </w:tcBorders>
-            <w:shd w:val="clear" w:color="auto" w:fill="auto"/>
             <w:noWrap/>
             <w:vAlign w:val="bottom"/>
           </w:tcPr>
@@ -6679,7 +7322,21 @@
               <w:rPr>
                 <w:sz w:val="12"/>
               </w:rPr>
-              <w:t>{restriccion_larga_distancia_internacional_si}</w:t>
+              <w:t>{</w:t>
+            </w:r>
+            <w:proofErr w:type="spellStart"/>
+            <w:r>
+              <w:rPr>
+                <w:sz w:val="12"/>
+              </w:rPr>
+              <w:t>restriccion_larga_distancia_internacional_si</w:t>
+            </w:r>
+            <w:proofErr w:type="spellEnd"/>
+            <w:r>
+              <w:rPr>
+                <w:sz w:val="12"/>
+              </w:rPr>
+              <w:t>}</w:t>
             </w:r>
           </w:p>
         </w:tc>
@@ -6721,7 +7378,6 @@
               <w:bottom w:val="single" w:sz="4" w:space="0" w:color="auto"/>
               <w:right w:val="single" w:sz="4" w:space="0" w:color="auto"/>
             </w:tcBorders>
-            <w:shd w:val="clear" w:color="auto" w:fill="auto"/>
             <w:noWrap/>
             <w:vAlign w:val="bottom"/>
           </w:tcPr>
@@ -6735,7 +7391,21 @@
               <w:rPr>
                 <w:sz w:val="12"/>
               </w:rPr>
-              <w:t>{restriccion_larga_distancia_internacional_no}</w:t>
+              <w:t>{</w:t>
+            </w:r>
+            <w:proofErr w:type="spellStart"/>
+            <w:r>
+              <w:rPr>
+                <w:sz w:val="12"/>
+              </w:rPr>
+              <w:t>restriccion_larga_distancia_internacional_no</w:t>
+            </w:r>
+            <w:proofErr w:type="spellEnd"/>
+            <w:r>
+              <w:rPr>
+                <w:sz w:val="12"/>
+              </w:rPr>
+              <w:t>}</w:t>
             </w:r>
           </w:p>
         </w:tc>
@@ -6774,20 +7444,33 @@
               <w:bottom w:val="single" w:sz="4" w:space="0" w:color="auto"/>
               <w:right w:val="single" w:sz="4" w:space="0" w:color="auto"/>
             </w:tcBorders>
-            <w:shd w:val="clear" w:color="auto" w:fill="auto"/>
-            <w:vAlign w:val="bottom"/>
-          </w:tcPr>
-          <w:p>
-            <w:pPr>
-              <w:rPr>
-                <w:rFonts w:ascii="Arial" w:hAnsi="Arial" w:cs="Arial"/>
-              </w:rPr>
-            </w:pPr>
-            <w:r>
-              <w:rPr>
-                <w:sz w:val="12"/>
-              </w:rPr>
-              <w:t>{restriccion_larga_distancia_internacional_na}</w:t>
+            <w:vAlign w:val="bottom"/>
+          </w:tcPr>
+          <w:p>
+            <w:pPr>
+              <w:rPr>
+                <w:rFonts w:ascii="Arial" w:hAnsi="Arial" w:cs="Arial"/>
+              </w:rPr>
+            </w:pPr>
+            <w:r>
+              <w:rPr>
+                <w:sz w:val="12"/>
+              </w:rPr>
+              <w:t>{</w:t>
+            </w:r>
+            <w:proofErr w:type="spellStart"/>
+            <w:r>
+              <w:rPr>
+                <w:sz w:val="12"/>
+              </w:rPr>
+              <w:t>restriccion_larga_distancia_internacional_na</w:t>
+            </w:r>
+            <w:proofErr w:type="spellEnd"/>
+            <w:r>
+              <w:rPr>
+                <w:sz w:val="12"/>
+              </w:rPr>
+              <w:t>}</w:t>
             </w:r>
           </w:p>
         </w:tc>
@@ -6887,7 +7570,6 @@
               <w:bottom w:val="single" w:sz="4" w:space="0" w:color="auto"/>
               <w:right w:val="single" w:sz="4" w:space="0" w:color="auto"/>
             </w:tcBorders>
-            <w:shd w:val="clear" w:color="auto" w:fill="auto"/>
             <w:noWrap/>
             <w:vAlign w:val="bottom"/>
           </w:tcPr>
@@ -6902,7 +7584,21 @@
               <w:rPr>
                 <w:sz w:val="12"/>
               </w:rPr>
-              <w:t>{restriccion_llamada_local_si}</w:t>
+              <w:t>{</w:t>
+            </w:r>
+            <w:proofErr w:type="spellStart"/>
+            <w:r>
+              <w:rPr>
+                <w:sz w:val="12"/>
+              </w:rPr>
+              <w:t>restriccion_llamada_local_si</w:t>
+            </w:r>
+            <w:proofErr w:type="spellEnd"/>
+            <w:r>
+              <w:rPr>
+                <w:sz w:val="12"/>
+              </w:rPr>
+              <w:t>}</w:t>
             </w:r>
           </w:p>
         </w:tc>
@@ -6944,7 +7640,6 @@
               <w:bottom w:val="single" w:sz="4" w:space="0" w:color="auto"/>
               <w:right w:val="single" w:sz="4" w:space="0" w:color="auto"/>
             </w:tcBorders>
-            <w:shd w:val="clear" w:color="auto" w:fill="auto"/>
             <w:noWrap/>
             <w:vAlign w:val="bottom"/>
           </w:tcPr>
@@ -6958,7 +7653,21 @@
               <w:rPr>
                 <w:sz w:val="12"/>
               </w:rPr>
-              <w:t>{restriccion_llamada_local_no}</w:t>
+              <w:t>{</w:t>
+            </w:r>
+            <w:proofErr w:type="spellStart"/>
+            <w:r>
+              <w:rPr>
+                <w:sz w:val="12"/>
+              </w:rPr>
+              <w:t>restriccion_llamada_local_no</w:t>
+            </w:r>
+            <w:proofErr w:type="spellEnd"/>
+            <w:r>
+              <w:rPr>
+                <w:sz w:val="12"/>
+              </w:rPr>
+              <w:t>}</w:t>
             </w:r>
           </w:p>
         </w:tc>
@@ -6997,20 +7706,33 @@
               <w:bottom w:val="single" w:sz="4" w:space="0" w:color="auto"/>
               <w:right w:val="single" w:sz="4" w:space="0" w:color="auto"/>
             </w:tcBorders>
-            <w:shd w:val="clear" w:color="auto" w:fill="auto"/>
-            <w:vAlign w:val="bottom"/>
-          </w:tcPr>
-          <w:p>
-            <w:pPr>
-              <w:rPr>
-                <w:rFonts w:ascii="Arial" w:hAnsi="Arial" w:cs="Arial"/>
-              </w:rPr>
-            </w:pPr>
-            <w:r>
-              <w:rPr>
-                <w:sz w:val="12"/>
-              </w:rPr>
-              <w:t>{restriccion_llamada_local_na}</w:t>
+            <w:vAlign w:val="bottom"/>
+          </w:tcPr>
+          <w:p>
+            <w:pPr>
+              <w:rPr>
+                <w:rFonts w:ascii="Arial" w:hAnsi="Arial" w:cs="Arial"/>
+              </w:rPr>
+            </w:pPr>
+            <w:r>
+              <w:rPr>
+                <w:sz w:val="12"/>
+              </w:rPr>
+              <w:t>{</w:t>
+            </w:r>
+            <w:proofErr w:type="spellStart"/>
+            <w:r>
+              <w:rPr>
+                <w:sz w:val="12"/>
+              </w:rPr>
+              <w:t>restriccion_llamada_local_na</w:t>
+            </w:r>
+            <w:proofErr w:type="spellEnd"/>
+            <w:r>
+              <w:rPr>
+                <w:sz w:val="12"/>
+              </w:rPr>
+              <w:t>}</w:t>
             </w:r>
           </w:p>
         </w:tc>
@@ -7109,7 +7831,6 @@
               <w:bottom w:val="single" w:sz="4" w:space="0" w:color="auto"/>
               <w:right w:val="single" w:sz="4" w:space="0" w:color="auto"/>
             </w:tcBorders>
-            <w:shd w:val="clear" w:color="auto" w:fill="auto"/>
             <w:noWrap/>
             <w:vAlign w:val="bottom"/>
           </w:tcPr>
@@ -7124,7 +7845,21 @@
               <w:rPr>
                 <w:sz w:val="12"/>
               </w:rPr>
-              <w:t>{restriccion_llamada_interna_si}</w:t>
+              <w:t>{</w:t>
+            </w:r>
+            <w:proofErr w:type="spellStart"/>
+            <w:r>
+              <w:rPr>
+                <w:sz w:val="12"/>
+              </w:rPr>
+              <w:t>restriccion_llamada_interna_si</w:t>
+            </w:r>
+            <w:proofErr w:type="spellEnd"/>
+            <w:r>
+              <w:rPr>
+                <w:sz w:val="12"/>
+              </w:rPr>
+              <w:t>}</w:t>
             </w:r>
           </w:p>
         </w:tc>
@@ -7166,7 +7901,6 @@
               <w:bottom w:val="single" w:sz="4" w:space="0" w:color="auto"/>
               <w:right w:val="single" w:sz="4" w:space="0" w:color="auto"/>
             </w:tcBorders>
-            <w:shd w:val="clear" w:color="auto" w:fill="auto"/>
             <w:noWrap/>
             <w:vAlign w:val="bottom"/>
           </w:tcPr>
@@ -7180,7 +7914,21 @@
               <w:rPr>
                 <w:sz w:val="12"/>
               </w:rPr>
-              <w:t>{restriccion_llamada_interna_no}</w:t>
+              <w:t>{</w:t>
+            </w:r>
+            <w:proofErr w:type="spellStart"/>
+            <w:r>
+              <w:rPr>
+                <w:sz w:val="12"/>
+              </w:rPr>
+              <w:t>restriccion_llamada_interna_no</w:t>
+            </w:r>
+            <w:proofErr w:type="spellEnd"/>
+            <w:r>
+              <w:rPr>
+                <w:sz w:val="12"/>
+              </w:rPr>
+              <w:t>}</w:t>
             </w:r>
           </w:p>
         </w:tc>
@@ -7219,20 +7967,33 @@
               <w:bottom w:val="single" w:sz="4" w:space="0" w:color="auto"/>
               <w:right w:val="single" w:sz="4" w:space="0" w:color="auto"/>
             </w:tcBorders>
-            <w:shd w:val="clear" w:color="auto" w:fill="auto"/>
-            <w:vAlign w:val="bottom"/>
-          </w:tcPr>
-          <w:p>
-            <w:pPr>
-              <w:rPr>
-                <w:rFonts w:ascii="Arial" w:hAnsi="Arial" w:cs="Arial"/>
-              </w:rPr>
-            </w:pPr>
-            <w:r>
-              <w:rPr>
-                <w:sz w:val="12"/>
-              </w:rPr>
-              <w:t>{restriccion_llamada_interna_na}</w:t>
+            <w:vAlign w:val="bottom"/>
+          </w:tcPr>
+          <w:p>
+            <w:pPr>
+              <w:rPr>
+                <w:rFonts w:ascii="Arial" w:hAnsi="Arial" w:cs="Arial"/>
+              </w:rPr>
+            </w:pPr>
+            <w:r>
+              <w:rPr>
+                <w:sz w:val="12"/>
+              </w:rPr>
+              <w:t>{</w:t>
+            </w:r>
+            <w:proofErr w:type="spellStart"/>
+            <w:r>
+              <w:rPr>
+                <w:sz w:val="12"/>
+              </w:rPr>
+              <w:t>restriccion_llamada_interna_na</w:t>
+            </w:r>
+            <w:proofErr w:type="spellEnd"/>
+            <w:r>
+              <w:rPr>
+                <w:sz w:val="12"/>
+              </w:rPr>
+              <w:t>}</w:t>
             </w:r>
           </w:p>
         </w:tc>
@@ -7332,7 +8093,6 @@
               <w:bottom w:val="single" w:sz="4" w:space="0" w:color="auto"/>
               <w:right w:val="single" w:sz="4" w:space="0" w:color="auto"/>
             </w:tcBorders>
-            <w:shd w:val="clear" w:color="auto" w:fill="auto"/>
             <w:noWrap/>
             <w:vAlign w:val="bottom"/>
           </w:tcPr>
@@ -7347,7 +8107,21 @@
               <w:rPr>
                 <w:sz w:val="12"/>
               </w:rPr>
-              <w:t>{directorio_corporativo_si}</w:t>
+              <w:t>{</w:t>
+            </w:r>
+            <w:proofErr w:type="spellStart"/>
+            <w:r>
+              <w:rPr>
+                <w:sz w:val="12"/>
+              </w:rPr>
+              <w:t>directorio_corporativo_si</w:t>
+            </w:r>
+            <w:proofErr w:type="spellEnd"/>
+            <w:r>
+              <w:rPr>
+                <w:sz w:val="12"/>
+              </w:rPr>
+              <w:t>}</w:t>
             </w:r>
           </w:p>
         </w:tc>
@@ -7389,7 +8163,6 @@
               <w:bottom w:val="single" w:sz="4" w:space="0" w:color="auto"/>
               <w:right w:val="single" w:sz="4" w:space="0" w:color="auto"/>
             </w:tcBorders>
-            <w:shd w:val="clear" w:color="auto" w:fill="auto"/>
             <w:noWrap/>
             <w:vAlign w:val="bottom"/>
           </w:tcPr>
@@ -7403,7 +8176,21 @@
               <w:rPr>
                 <w:sz w:val="12"/>
               </w:rPr>
-              <w:t>{directorio_corporativo_no}</w:t>
+              <w:t>{</w:t>
+            </w:r>
+            <w:proofErr w:type="spellStart"/>
+            <w:r>
+              <w:rPr>
+                <w:sz w:val="12"/>
+              </w:rPr>
+              <w:t>directorio_corporativo_no</w:t>
+            </w:r>
+            <w:proofErr w:type="spellEnd"/>
+            <w:r>
+              <w:rPr>
+                <w:sz w:val="12"/>
+              </w:rPr>
+              <w:t>}</w:t>
             </w:r>
           </w:p>
         </w:tc>
@@ -7442,20 +8229,33 @@
               <w:bottom w:val="single" w:sz="4" w:space="0" w:color="auto"/>
               <w:right w:val="single" w:sz="4" w:space="0" w:color="auto"/>
             </w:tcBorders>
-            <w:shd w:val="clear" w:color="auto" w:fill="auto"/>
-            <w:vAlign w:val="bottom"/>
-          </w:tcPr>
-          <w:p>
-            <w:pPr>
-              <w:rPr>
-                <w:rFonts w:ascii="Arial" w:hAnsi="Arial" w:cs="Arial"/>
-              </w:rPr>
-            </w:pPr>
-            <w:r>
-              <w:rPr>
-                <w:sz w:val="12"/>
-              </w:rPr>
-              <w:t>{directorio_corporativo_na}</w:t>
+            <w:vAlign w:val="bottom"/>
+          </w:tcPr>
+          <w:p>
+            <w:pPr>
+              <w:rPr>
+                <w:rFonts w:ascii="Arial" w:hAnsi="Arial" w:cs="Arial"/>
+              </w:rPr>
+            </w:pPr>
+            <w:r>
+              <w:rPr>
+                <w:sz w:val="12"/>
+              </w:rPr>
+              <w:t>{</w:t>
+            </w:r>
+            <w:proofErr w:type="spellStart"/>
+            <w:r>
+              <w:rPr>
+                <w:sz w:val="12"/>
+              </w:rPr>
+              <w:t>directorio_corporativo_na</w:t>
+            </w:r>
+            <w:proofErr w:type="spellEnd"/>
+            <w:r>
+              <w:rPr>
+                <w:sz w:val="12"/>
+              </w:rPr>
+              <w:t>}</w:t>
             </w:r>
           </w:p>
         </w:tc>
@@ -7555,7 +8355,6 @@
               <w:bottom w:val="single" w:sz="4" w:space="0" w:color="auto"/>
               <w:right w:val="single" w:sz="4" w:space="0" w:color="auto"/>
             </w:tcBorders>
-            <w:shd w:val="clear" w:color="auto" w:fill="auto"/>
             <w:noWrap/>
             <w:vAlign w:val="bottom"/>
           </w:tcPr>
@@ -7570,7 +8369,21 @@
               <w:rPr>
                 <w:sz w:val="12"/>
               </w:rPr>
-              <w:t>{llamadas_perdidas_si}</w:t>
+              <w:t>{</w:t>
+            </w:r>
+            <w:proofErr w:type="spellStart"/>
+            <w:r>
+              <w:rPr>
+                <w:sz w:val="12"/>
+              </w:rPr>
+              <w:t>llamadas_perdidas_si</w:t>
+            </w:r>
+            <w:proofErr w:type="spellEnd"/>
+            <w:r>
+              <w:rPr>
+                <w:sz w:val="12"/>
+              </w:rPr>
+              <w:t>}</w:t>
             </w:r>
           </w:p>
         </w:tc>
@@ -7612,7 +8425,6 @@
               <w:bottom w:val="single" w:sz="4" w:space="0" w:color="auto"/>
               <w:right w:val="single" w:sz="4" w:space="0" w:color="auto"/>
             </w:tcBorders>
-            <w:shd w:val="clear" w:color="auto" w:fill="auto"/>
             <w:noWrap/>
             <w:vAlign w:val="bottom"/>
           </w:tcPr>
@@ -7626,7 +8438,21 @@
               <w:rPr>
                 <w:sz w:val="12"/>
               </w:rPr>
-              <w:t>{llamadas_perdidas_no}</w:t>
+              <w:t>{</w:t>
+            </w:r>
+            <w:proofErr w:type="spellStart"/>
+            <w:r>
+              <w:rPr>
+                <w:sz w:val="12"/>
+              </w:rPr>
+              <w:t>llamadas_perdidas_no</w:t>
+            </w:r>
+            <w:proofErr w:type="spellEnd"/>
+            <w:r>
+              <w:rPr>
+                <w:sz w:val="12"/>
+              </w:rPr>
+              <w:t>}</w:t>
             </w:r>
           </w:p>
         </w:tc>
@@ -7665,20 +8491,33 @@
               <w:bottom w:val="single" w:sz="4" w:space="0" w:color="auto"/>
               <w:right w:val="single" w:sz="4" w:space="0" w:color="auto"/>
             </w:tcBorders>
-            <w:shd w:val="clear" w:color="auto" w:fill="auto"/>
-            <w:vAlign w:val="bottom"/>
-          </w:tcPr>
-          <w:p>
-            <w:pPr>
-              <w:rPr>
-                <w:rFonts w:ascii="Arial" w:hAnsi="Arial" w:cs="Arial"/>
-              </w:rPr>
-            </w:pPr>
-            <w:r>
-              <w:rPr>
-                <w:sz w:val="12"/>
-              </w:rPr>
-              <w:t>{llamadas_perdidas_na}</w:t>
+            <w:vAlign w:val="bottom"/>
+          </w:tcPr>
+          <w:p>
+            <w:pPr>
+              <w:rPr>
+                <w:rFonts w:ascii="Arial" w:hAnsi="Arial" w:cs="Arial"/>
+              </w:rPr>
+            </w:pPr>
+            <w:r>
+              <w:rPr>
+                <w:sz w:val="12"/>
+              </w:rPr>
+              <w:t>{</w:t>
+            </w:r>
+            <w:proofErr w:type="spellStart"/>
+            <w:r>
+              <w:rPr>
+                <w:sz w:val="12"/>
+              </w:rPr>
+              <w:t>llamadas_perdidas_na</w:t>
+            </w:r>
+            <w:proofErr w:type="spellEnd"/>
+            <w:r>
+              <w:rPr>
+                <w:sz w:val="12"/>
+              </w:rPr>
+              <w:t>}</w:t>
             </w:r>
           </w:p>
         </w:tc>
@@ -7779,7 +8618,6 @@
               <w:bottom w:val="single" w:sz="4" w:space="0" w:color="auto"/>
               <w:right w:val="single" w:sz="4" w:space="0" w:color="auto"/>
             </w:tcBorders>
-            <w:shd w:val="clear" w:color="auto" w:fill="auto"/>
             <w:noWrap/>
             <w:vAlign w:val="bottom"/>
           </w:tcPr>
@@ -7794,7 +8632,21 @@
               <w:rPr>
                 <w:sz w:val="12"/>
               </w:rPr>
-              <w:t>{captura_llamada_extensiones_oficina_si}</w:t>
+              <w:t>{</w:t>
+            </w:r>
+            <w:proofErr w:type="spellStart"/>
+            <w:r>
+              <w:rPr>
+                <w:sz w:val="12"/>
+              </w:rPr>
+              <w:t>captura_llamada_extensiones_oficina_si</w:t>
+            </w:r>
+            <w:proofErr w:type="spellEnd"/>
+            <w:r>
+              <w:rPr>
+                <w:sz w:val="12"/>
+              </w:rPr>
+              <w:t>}</w:t>
             </w:r>
           </w:p>
         </w:tc>
@@ -7836,7 +8688,6 @@
               <w:bottom w:val="single" w:sz="4" w:space="0" w:color="auto"/>
               <w:right w:val="single" w:sz="4" w:space="0" w:color="auto"/>
             </w:tcBorders>
-            <w:shd w:val="clear" w:color="auto" w:fill="auto"/>
             <w:noWrap/>
             <w:vAlign w:val="bottom"/>
           </w:tcPr>
@@ -7850,7 +8701,21 @@
               <w:rPr>
                 <w:sz w:val="12"/>
               </w:rPr>
-              <w:t>{captura_llamada_extensiones_oficina_no}</w:t>
+              <w:t>{</w:t>
+            </w:r>
+            <w:proofErr w:type="spellStart"/>
+            <w:r>
+              <w:rPr>
+                <w:sz w:val="12"/>
+              </w:rPr>
+              <w:t>captura_llamada_extensiones_oficina_no</w:t>
+            </w:r>
+            <w:proofErr w:type="spellEnd"/>
+            <w:r>
+              <w:rPr>
+                <w:sz w:val="12"/>
+              </w:rPr>
+              <w:t>}</w:t>
             </w:r>
           </w:p>
         </w:tc>
@@ -7889,20 +8754,33 @@
               <w:bottom w:val="single" w:sz="4" w:space="0" w:color="auto"/>
               <w:right w:val="single" w:sz="4" w:space="0" w:color="auto"/>
             </w:tcBorders>
-            <w:shd w:val="clear" w:color="auto" w:fill="auto"/>
-            <w:vAlign w:val="bottom"/>
-          </w:tcPr>
-          <w:p>
-            <w:pPr>
-              <w:rPr>
-                <w:rFonts w:ascii="Arial" w:hAnsi="Arial" w:cs="Arial"/>
-              </w:rPr>
-            </w:pPr>
-            <w:r>
-              <w:rPr>
-                <w:sz w:val="12"/>
-              </w:rPr>
-              <w:t>{captura_llamada_extensiones_oficina_na}</w:t>
+            <w:vAlign w:val="bottom"/>
+          </w:tcPr>
+          <w:p>
+            <w:pPr>
+              <w:rPr>
+                <w:rFonts w:ascii="Arial" w:hAnsi="Arial" w:cs="Arial"/>
+              </w:rPr>
+            </w:pPr>
+            <w:r>
+              <w:rPr>
+                <w:sz w:val="12"/>
+              </w:rPr>
+              <w:t>{</w:t>
+            </w:r>
+            <w:proofErr w:type="spellStart"/>
+            <w:r>
+              <w:rPr>
+                <w:sz w:val="12"/>
+              </w:rPr>
+              <w:t>captura_llamada_extensiones_oficina_na</w:t>
+            </w:r>
+            <w:proofErr w:type="spellEnd"/>
+            <w:r>
+              <w:rPr>
+                <w:sz w:val="12"/>
+              </w:rPr>
+              <w:t>}</w:t>
             </w:r>
           </w:p>
         </w:tc>
@@ -8011,7 +8889,6 @@
               <w:bottom w:val="single" w:sz="4" w:space="0" w:color="auto"/>
               <w:right w:val="single" w:sz="4" w:space="0" w:color="auto"/>
             </w:tcBorders>
-            <w:shd w:val="clear" w:color="auto" w:fill="auto"/>
             <w:noWrap/>
             <w:vAlign w:val="bottom"/>
           </w:tcPr>
@@ -8026,7 +8903,21 @@
               <w:rPr>
                 <w:sz w:val="12"/>
               </w:rPr>
-              <w:t>{llamada_entre_extensiones_si}</w:t>
+              <w:t>{</w:t>
+            </w:r>
+            <w:proofErr w:type="spellStart"/>
+            <w:r>
+              <w:rPr>
+                <w:sz w:val="12"/>
+              </w:rPr>
+              <w:t>llamada_entre_extensiones_si</w:t>
+            </w:r>
+            <w:proofErr w:type="spellEnd"/>
+            <w:r>
+              <w:rPr>
+                <w:sz w:val="12"/>
+              </w:rPr>
+              <w:t>}</w:t>
             </w:r>
           </w:p>
         </w:tc>
@@ -8068,7 +8959,6 @@
               <w:bottom w:val="single" w:sz="4" w:space="0" w:color="auto"/>
               <w:right w:val="single" w:sz="4" w:space="0" w:color="auto"/>
             </w:tcBorders>
-            <w:shd w:val="clear" w:color="auto" w:fill="auto"/>
             <w:noWrap/>
             <w:vAlign w:val="bottom"/>
           </w:tcPr>
@@ -8082,7 +8972,21 @@
               <w:rPr>
                 <w:sz w:val="12"/>
               </w:rPr>
-              <w:t>{llamada_entre_extensiones_no}</w:t>
+              <w:t>{</w:t>
+            </w:r>
+            <w:proofErr w:type="spellStart"/>
+            <w:r>
+              <w:rPr>
+                <w:sz w:val="12"/>
+              </w:rPr>
+              <w:t>llamada_entre_extensiones_no</w:t>
+            </w:r>
+            <w:proofErr w:type="spellEnd"/>
+            <w:r>
+              <w:rPr>
+                <w:sz w:val="12"/>
+              </w:rPr>
+              <w:t>}</w:t>
             </w:r>
           </w:p>
         </w:tc>
@@ -8121,20 +9025,33 @@
               <w:bottom w:val="single" w:sz="4" w:space="0" w:color="auto"/>
               <w:right w:val="single" w:sz="4" w:space="0" w:color="auto"/>
             </w:tcBorders>
-            <w:shd w:val="clear" w:color="auto" w:fill="auto"/>
-            <w:vAlign w:val="bottom"/>
-          </w:tcPr>
-          <w:p>
-            <w:pPr>
-              <w:rPr>
-                <w:rFonts w:ascii="Arial" w:hAnsi="Arial" w:cs="Arial"/>
-              </w:rPr>
-            </w:pPr>
-            <w:r>
-              <w:rPr>
-                <w:sz w:val="12"/>
-              </w:rPr>
-              <w:t>{llamada_entre_extensiones_na}</w:t>
+            <w:vAlign w:val="bottom"/>
+          </w:tcPr>
+          <w:p>
+            <w:pPr>
+              <w:rPr>
+                <w:rFonts w:ascii="Arial" w:hAnsi="Arial" w:cs="Arial"/>
+              </w:rPr>
+            </w:pPr>
+            <w:r>
+              <w:rPr>
+                <w:sz w:val="12"/>
+              </w:rPr>
+              <w:t>{</w:t>
+            </w:r>
+            <w:proofErr w:type="spellStart"/>
+            <w:r>
+              <w:rPr>
+                <w:sz w:val="12"/>
+              </w:rPr>
+              <w:t>llamada_entre_extensiones_na</w:t>
+            </w:r>
+            <w:proofErr w:type="spellEnd"/>
+            <w:r>
+              <w:rPr>
+                <w:sz w:val="12"/>
+              </w:rPr>
+              <w:t>}</w:t>
             </w:r>
           </w:p>
         </w:tc>
@@ -8245,7 +9162,6 @@
               <w:bottom w:val="single" w:sz="4" w:space="0" w:color="auto"/>
               <w:right w:val="single" w:sz="4" w:space="0" w:color="auto"/>
             </w:tcBorders>
-            <w:shd w:val="clear" w:color="auto" w:fill="auto"/>
             <w:noWrap/>
             <w:vAlign w:val="bottom"/>
           </w:tcPr>
@@ -8260,7 +9176,21 @@
               <w:rPr>
                 <w:sz w:val="12"/>
               </w:rPr>
-              <w:t>{password_telefono_extension_movil_si}</w:t>
+              <w:t>{</w:t>
+            </w:r>
+            <w:proofErr w:type="spellStart"/>
+            <w:r>
+              <w:rPr>
+                <w:sz w:val="12"/>
+              </w:rPr>
+              <w:t>password_telefono_extension_movil_si</w:t>
+            </w:r>
+            <w:proofErr w:type="spellEnd"/>
+            <w:r>
+              <w:rPr>
+                <w:sz w:val="12"/>
+              </w:rPr>
+              <w:t>}</w:t>
             </w:r>
           </w:p>
         </w:tc>
@@ -8302,7 +9232,6 @@
               <w:bottom w:val="single" w:sz="4" w:space="0" w:color="auto"/>
               <w:right w:val="single" w:sz="4" w:space="0" w:color="auto"/>
             </w:tcBorders>
-            <w:shd w:val="clear" w:color="auto" w:fill="auto"/>
             <w:noWrap/>
             <w:vAlign w:val="bottom"/>
           </w:tcPr>
@@ -8316,7 +9245,21 @@
               <w:rPr>
                 <w:sz w:val="12"/>
               </w:rPr>
-              <w:t>{password_telefono_extension_movil_no}</w:t>
+              <w:t>{</w:t>
+            </w:r>
+            <w:proofErr w:type="spellStart"/>
+            <w:r>
+              <w:rPr>
+                <w:sz w:val="12"/>
+              </w:rPr>
+              <w:t>password_telefono_extension_movil_no</w:t>
+            </w:r>
+            <w:proofErr w:type="spellEnd"/>
+            <w:r>
+              <w:rPr>
+                <w:sz w:val="12"/>
+              </w:rPr>
+              <w:t>}</w:t>
             </w:r>
           </w:p>
         </w:tc>
@@ -8355,20 +9298,33 @@
               <w:bottom w:val="single" w:sz="4" w:space="0" w:color="auto"/>
               <w:right w:val="single" w:sz="4" w:space="0" w:color="auto"/>
             </w:tcBorders>
-            <w:shd w:val="clear" w:color="auto" w:fill="auto"/>
-            <w:vAlign w:val="bottom"/>
-          </w:tcPr>
-          <w:p>
-            <w:pPr>
-              <w:rPr>
-                <w:rFonts w:ascii="Arial" w:hAnsi="Arial" w:cs="Arial"/>
-              </w:rPr>
-            </w:pPr>
-            <w:r>
-              <w:rPr>
-                <w:sz w:val="12"/>
-              </w:rPr>
-              <w:t>{password_telefono_extension_movil_na}</w:t>
+            <w:vAlign w:val="bottom"/>
+          </w:tcPr>
+          <w:p>
+            <w:pPr>
+              <w:rPr>
+                <w:rFonts w:ascii="Arial" w:hAnsi="Arial" w:cs="Arial"/>
+              </w:rPr>
+            </w:pPr>
+            <w:r>
+              <w:rPr>
+                <w:sz w:val="12"/>
+              </w:rPr>
+              <w:t>{</w:t>
+            </w:r>
+            <w:proofErr w:type="spellStart"/>
+            <w:r>
+              <w:rPr>
+                <w:sz w:val="12"/>
+              </w:rPr>
+              <w:t>password_telefono_extension_movil_na</w:t>
+            </w:r>
+            <w:proofErr w:type="spellEnd"/>
+            <w:r>
+              <w:rPr>
+                <w:sz w:val="12"/>
+              </w:rPr>
+              <w:t>}</w:t>
             </w:r>
           </w:p>
         </w:tc>
@@ -8485,7 +9441,6 @@
               <w:bottom w:val="single" w:sz="4" w:space="0" w:color="auto"/>
               <w:right w:val="single" w:sz="4" w:space="0" w:color="auto"/>
             </w:tcBorders>
-            <w:shd w:val="clear" w:color="auto" w:fill="auto"/>
             <w:noWrap/>
             <w:vAlign w:val="bottom"/>
           </w:tcPr>
@@ -8500,7 +9455,21 @@
               <w:rPr>
                 <w:sz w:val="12"/>
               </w:rPr>
-              <w:t>{directorio_personalizado_si}</w:t>
+              <w:t>{</w:t>
+            </w:r>
+            <w:proofErr w:type="spellStart"/>
+            <w:r>
+              <w:rPr>
+                <w:sz w:val="12"/>
+              </w:rPr>
+              <w:t>directorio_personalizado_si</w:t>
+            </w:r>
+            <w:proofErr w:type="spellEnd"/>
+            <w:r>
+              <w:rPr>
+                <w:sz w:val="12"/>
+              </w:rPr>
+              <w:t>}</w:t>
             </w:r>
           </w:p>
         </w:tc>
@@ -8542,7 +9511,6 @@
               <w:bottom w:val="single" w:sz="4" w:space="0" w:color="auto"/>
               <w:right w:val="single" w:sz="4" w:space="0" w:color="auto"/>
             </w:tcBorders>
-            <w:shd w:val="clear" w:color="auto" w:fill="auto"/>
             <w:noWrap/>
             <w:vAlign w:val="bottom"/>
           </w:tcPr>
@@ -8556,7 +9524,21 @@
               <w:rPr>
                 <w:sz w:val="12"/>
               </w:rPr>
-              <w:t>{directorio_personalizado_no}</w:t>
+              <w:t>{</w:t>
+            </w:r>
+            <w:proofErr w:type="spellStart"/>
+            <w:r>
+              <w:rPr>
+                <w:sz w:val="12"/>
+              </w:rPr>
+              <w:t>directorio_personalizado_no</w:t>
+            </w:r>
+            <w:proofErr w:type="spellEnd"/>
+            <w:r>
+              <w:rPr>
+                <w:sz w:val="12"/>
+              </w:rPr>
+              <w:t>}</w:t>
             </w:r>
           </w:p>
         </w:tc>
@@ -8595,20 +9577,33 @@
               <w:bottom w:val="single" w:sz="4" w:space="0" w:color="auto"/>
               <w:right w:val="single" w:sz="4" w:space="0" w:color="auto"/>
             </w:tcBorders>
-            <w:shd w:val="clear" w:color="auto" w:fill="auto"/>
-            <w:vAlign w:val="bottom"/>
-          </w:tcPr>
-          <w:p>
-            <w:pPr>
-              <w:rPr>
-                <w:rFonts w:ascii="Arial" w:hAnsi="Arial" w:cs="Arial"/>
-              </w:rPr>
-            </w:pPr>
-            <w:r>
-              <w:rPr>
-                <w:sz w:val="12"/>
-              </w:rPr>
-              <w:t>{directorio_personalizado_na}</w:t>
+            <w:vAlign w:val="bottom"/>
+          </w:tcPr>
+          <w:p>
+            <w:pPr>
+              <w:rPr>
+                <w:rFonts w:ascii="Arial" w:hAnsi="Arial" w:cs="Arial"/>
+              </w:rPr>
+            </w:pPr>
+            <w:r>
+              <w:rPr>
+                <w:sz w:val="12"/>
+              </w:rPr>
+              <w:t>{</w:t>
+            </w:r>
+            <w:proofErr w:type="spellStart"/>
+            <w:r>
+              <w:rPr>
+                <w:sz w:val="12"/>
+              </w:rPr>
+              <w:t>directorio_personalizado_na</w:t>
+            </w:r>
+            <w:proofErr w:type="spellEnd"/>
+            <w:r>
+              <w:rPr>
+                <w:sz w:val="12"/>
+              </w:rPr>
+              <w:t>}</w:t>
             </w:r>
           </w:p>
         </w:tc>
@@ -8711,7 +9706,6 @@
               <w:bottom w:val="single" w:sz="4" w:space="0" w:color="auto"/>
               <w:right w:val="single" w:sz="4" w:space="0" w:color="auto"/>
             </w:tcBorders>
-            <w:shd w:val="clear" w:color="auto" w:fill="auto"/>
             <w:noWrap/>
             <w:vAlign w:val="bottom"/>
           </w:tcPr>
@@ -8726,7 +9720,21 @@
               <w:rPr>
                 <w:sz w:val="12"/>
               </w:rPr>
-              <w:t>{pruebas_extensiones_analogas_fax_si}</w:t>
+              <w:t>{</w:t>
+            </w:r>
+            <w:proofErr w:type="spellStart"/>
+            <w:r>
+              <w:rPr>
+                <w:sz w:val="12"/>
+              </w:rPr>
+              <w:t>pruebas_extensiones_analogas_fax_si</w:t>
+            </w:r>
+            <w:proofErr w:type="spellEnd"/>
+            <w:r>
+              <w:rPr>
+                <w:sz w:val="12"/>
+              </w:rPr>
+              <w:t>}</w:t>
             </w:r>
           </w:p>
         </w:tc>
@@ -8768,7 +9776,6 @@
               <w:bottom w:val="single" w:sz="4" w:space="0" w:color="auto"/>
               <w:right w:val="single" w:sz="4" w:space="0" w:color="auto"/>
             </w:tcBorders>
-            <w:shd w:val="clear" w:color="auto" w:fill="auto"/>
             <w:noWrap/>
             <w:vAlign w:val="bottom"/>
           </w:tcPr>
@@ -8782,7 +9789,21 @@
               <w:rPr>
                 <w:sz w:val="12"/>
               </w:rPr>
-              <w:t>{pruebas_extensiones_analogas_fax_no}</w:t>
+              <w:t>{</w:t>
+            </w:r>
+            <w:proofErr w:type="spellStart"/>
+            <w:r>
+              <w:rPr>
+                <w:sz w:val="12"/>
+              </w:rPr>
+              <w:t>pruebas_extensiones_analogas_fax_no</w:t>
+            </w:r>
+            <w:proofErr w:type="spellEnd"/>
+            <w:r>
+              <w:rPr>
+                <w:sz w:val="12"/>
+              </w:rPr>
+              <w:t>}</w:t>
             </w:r>
           </w:p>
         </w:tc>
@@ -8821,20 +9842,33 @@
               <w:bottom w:val="single" w:sz="4" w:space="0" w:color="auto"/>
               <w:right w:val="single" w:sz="4" w:space="0" w:color="auto"/>
             </w:tcBorders>
-            <w:shd w:val="clear" w:color="auto" w:fill="auto"/>
-            <w:vAlign w:val="bottom"/>
-          </w:tcPr>
-          <w:p>
-            <w:pPr>
-              <w:rPr>
-                <w:rFonts w:ascii="Arial" w:hAnsi="Arial" w:cs="Arial"/>
-              </w:rPr>
-            </w:pPr>
-            <w:r>
-              <w:rPr>
-                <w:sz w:val="12"/>
-              </w:rPr>
-              <w:t>{pruebas_extensiones_analogas_fax_na}</w:t>
+            <w:vAlign w:val="bottom"/>
+          </w:tcPr>
+          <w:p>
+            <w:pPr>
+              <w:rPr>
+                <w:rFonts w:ascii="Arial" w:hAnsi="Arial" w:cs="Arial"/>
+              </w:rPr>
+            </w:pPr>
+            <w:r>
+              <w:rPr>
+                <w:sz w:val="12"/>
+              </w:rPr>
+              <w:t>{</w:t>
+            </w:r>
+            <w:proofErr w:type="spellStart"/>
+            <w:r>
+              <w:rPr>
+                <w:sz w:val="12"/>
+              </w:rPr>
+              <w:t>pruebas_extensiones_analogas_fax_na</w:t>
+            </w:r>
+            <w:proofErr w:type="spellEnd"/>
+            <w:r>
+              <w:rPr>
+                <w:sz w:val="12"/>
+              </w:rPr>
+              <w:t>}</w:t>
             </w:r>
           </w:p>
         </w:tc>
@@ -8936,7 +9970,6 @@
               <w:bottom w:val="single" w:sz="4" w:space="0" w:color="auto"/>
               <w:right w:val="single" w:sz="4" w:space="0" w:color="auto"/>
             </w:tcBorders>
-            <w:shd w:val="clear" w:color="auto" w:fill="auto"/>
             <w:noWrap/>
             <w:vAlign w:val="bottom"/>
           </w:tcPr>
@@ -8951,7 +9984,21 @@
               <w:rPr>
                 <w:sz w:val="12"/>
               </w:rPr>
-              <w:t>{buzon_voz_saludo_si}</w:t>
+              <w:t>{</w:t>
+            </w:r>
+            <w:proofErr w:type="spellStart"/>
+            <w:r>
+              <w:rPr>
+                <w:sz w:val="12"/>
+              </w:rPr>
+              <w:t>buzon_voz_saludo_si</w:t>
+            </w:r>
+            <w:proofErr w:type="spellEnd"/>
+            <w:r>
+              <w:rPr>
+                <w:sz w:val="12"/>
+              </w:rPr>
+              <w:t>}</w:t>
             </w:r>
           </w:p>
         </w:tc>
@@ -8993,7 +10040,6 @@
               <w:bottom w:val="single" w:sz="4" w:space="0" w:color="auto"/>
               <w:right w:val="single" w:sz="4" w:space="0" w:color="auto"/>
             </w:tcBorders>
-            <w:shd w:val="clear" w:color="auto" w:fill="auto"/>
             <w:noWrap/>
             <w:vAlign w:val="bottom"/>
           </w:tcPr>
@@ -9007,7 +10053,21 @@
               <w:rPr>
                 <w:sz w:val="12"/>
               </w:rPr>
-              <w:t>{buzon_voz_saludo_no}</w:t>
+              <w:t>{</w:t>
+            </w:r>
+            <w:proofErr w:type="spellStart"/>
+            <w:r>
+              <w:rPr>
+                <w:sz w:val="12"/>
+              </w:rPr>
+              <w:t>buzon_voz_saludo_no</w:t>
+            </w:r>
+            <w:proofErr w:type="spellEnd"/>
+            <w:r>
+              <w:rPr>
+                <w:sz w:val="12"/>
+              </w:rPr>
+              <w:t>}</w:t>
             </w:r>
           </w:p>
         </w:tc>
@@ -9046,20 +10106,33 @@
               <w:bottom w:val="single" w:sz="4" w:space="0" w:color="auto"/>
               <w:right w:val="single" w:sz="4" w:space="0" w:color="auto"/>
             </w:tcBorders>
-            <w:shd w:val="clear" w:color="auto" w:fill="auto"/>
-            <w:vAlign w:val="bottom"/>
-          </w:tcPr>
-          <w:p>
-            <w:pPr>
-              <w:rPr>
-                <w:rFonts w:ascii="Arial" w:hAnsi="Arial" w:cs="Arial"/>
-              </w:rPr>
-            </w:pPr>
-            <w:r>
-              <w:rPr>
-                <w:sz w:val="12"/>
-              </w:rPr>
-              <w:t>{buzon_voz_saludo_na}</w:t>
+            <w:vAlign w:val="bottom"/>
+          </w:tcPr>
+          <w:p>
+            <w:pPr>
+              <w:rPr>
+                <w:rFonts w:ascii="Arial" w:hAnsi="Arial" w:cs="Arial"/>
+              </w:rPr>
+            </w:pPr>
+            <w:r>
+              <w:rPr>
+                <w:sz w:val="12"/>
+              </w:rPr>
+              <w:t>{</w:t>
+            </w:r>
+            <w:proofErr w:type="spellStart"/>
+            <w:r>
+              <w:rPr>
+                <w:sz w:val="12"/>
+              </w:rPr>
+              <w:t>buzon_voz_saludo_na</w:t>
+            </w:r>
+            <w:proofErr w:type="spellEnd"/>
+            <w:r>
+              <w:rPr>
+                <w:sz w:val="12"/>
+              </w:rPr>
+              <w:t>}</w:t>
             </w:r>
           </w:p>
         </w:tc>
@@ -9161,7 +10234,6 @@
               <w:bottom w:val="single" w:sz="4" w:space="0" w:color="auto"/>
               <w:right w:val="single" w:sz="4" w:space="0" w:color="auto"/>
             </w:tcBorders>
-            <w:shd w:val="clear" w:color="auto" w:fill="auto"/>
             <w:noWrap/>
             <w:vAlign w:val="bottom"/>
           </w:tcPr>
@@ -9176,7 +10248,21 @@
               <w:rPr>
                 <w:sz w:val="12"/>
               </w:rPr>
-              <w:t>{buzon_mensajes_funcionalidad_cero_si}</w:t>
+              <w:t>{</w:t>
+            </w:r>
+            <w:proofErr w:type="spellStart"/>
+            <w:r>
+              <w:rPr>
+                <w:sz w:val="12"/>
+              </w:rPr>
+              <w:t>buzon_mensajes_funcionalidad_cero_si</w:t>
+            </w:r>
+            <w:proofErr w:type="spellEnd"/>
+            <w:r>
+              <w:rPr>
+                <w:sz w:val="12"/>
+              </w:rPr>
+              <w:t>}</w:t>
             </w:r>
           </w:p>
         </w:tc>
@@ -9218,7 +10304,6 @@
               <w:bottom w:val="single" w:sz="4" w:space="0" w:color="auto"/>
               <w:right w:val="single" w:sz="4" w:space="0" w:color="auto"/>
             </w:tcBorders>
-            <w:shd w:val="clear" w:color="auto" w:fill="auto"/>
             <w:noWrap/>
             <w:vAlign w:val="bottom"/>
           </w:tcPr>
@@ -9232,7 +10317,21 @@
               <w:rPr>
                 <w:sz w:val="12"/>
               </w:rPr>
-              <w:t>{buzon_mensajes_funcionalidad_cero_no}</w:t>
+              <w:t>{</w:t>
+            </w:r>
+            <w:proofErr w:type="spellStart"/>
+            <w:r>
+              <w:rPr>
+                <w:sz w:val="12"/>
+              </w:rPr>
+              <w:t>buzon_mensajes_funcionalidad_cero_no</w:t>
+            </w:r>
+            <w:proofErr w:type="spellEnd"/>
+            <w:r>
+              <w:rPr>
+                <w:sz w:val="12"/>
+              </w:rPr>
+              <w:t>}</w:t>
             </w:r>
           </w:p>
         </w:tc>
@@ -9271,20 +10370,33 @@
               <w:bottom w:val="single" w:sz="4" w:space="0" w:color="auto"/>
               <w:right w:val="single" w:sz="4" w:space="0" w:color="auto"/>
             </w:tcBorders>
-            <w:shd w:val="clear" w:color="auto" w:fill="auto"/>
-            <w:vAlign w:val="bottom"/>
-          </w:tcPr>
-          <w:p>
-            <w:pPr>
-              <w:rPr>
-                <w:rFonts w:ascii="Arial" w:hAnsi="Arial" w:cs="Arial"/>
-              </w:rPr>
-            </w:pPr>
-            <w:r>
-              <w:rPr>
-                <w:sz w:val="12"/>
-              </w:rPr>
-              <w:t>{buzon_mensajes_funcionalidad_cero_na}</w:t>
+            <w:vAlign w:val="bottom"/>
+          </w:tcPr>
+          <w:p>
+            <w:pPr>
+              <w:rPr>
+                <w:rFonts w:ascii="Arial" w:hAnsi="Arial" w:cs="Arial"/>
+              </w:rPr>
+            </w:pPr>
+            <w:r>
+              <w:rPr>
+                <w:sz w:val="12"/>
+              </w:rPr>
+              <w:t>{</w:t>
+            </w:r>
+            <w:proofErr w:type="spellStart"/>
+            <w:r>
+              <w:rPr>
+                <w:sz w:val="12"/>
+              </w:rPr>
+              <w:t>buzon_mensajes_funcionalidad_cero_na</w:t>
+            </w:r>
+            <w:proofErr w:type="spellEnd"/>
+            <w:r>
+              <w:rPr>
+                <w:sz w:val="12"/>
+              </w:rPr>
+              <w:t>}</w:t>
             </w:r>
           </w:p>
         </w:tc>
@@ -9379,7 +10491,6 @@
               <w:bottom w:val="single" w:sz="4" w:space="0" w:color="auto"/>
               <w:right w:val="single" w:sz="4" w:space="0" w:color="auto"/>
             </w:tcBorders>
-            <w:shd w:val="clear" w:color="auto" w:fill="auto"/>
             <w:noWrap/>
             <w:vAlign w:val="bottom"/>
           </w:tcPr>
@@ -9394,7 +10505,21 @@
               <w:rPr>
                 <w:sz w:val="12"/>
               </w:rPr>
-              <w:t>{capacitacion_si}</w:t>
+              <w:t>{</w:t>
+            </w:r>
+            <w:proofErr w:type="spellStart"/>
+            <w:r>
+              <w:rPr>
+                <w:sz w:val="12"/>
+              </w:rPr>
+              <w:t>capacitacion_si</w:t>
+            </w:r>
+            <w:proofErr w:type="spellEnd"/>
+            <w:r>
+              <w:rPr>
+                <w:sz w:val="12"/>
+              </w:rPr>
+              <w:t>}</w:t>
             </w:r>
           </w:p>
         </w:tc>
@@ -9436,7 +10561,6 @@
               <w:bottom w:val="single" w:sz="4" w:space="0" w:color="auto"/>
               <w:right w:val="single" w:sz="4" w:space="0" w:color="auto"/>
             </w:tcBorders>
-            <w:shd w:val="clear" w:color="auto" w:fill="auto"/>
             <w:noWrap/>
             <w:vAlign w:val="bottom"/>
           </w:tcPr>
@@ -9450,7 +10574,21 @@
               <w:rPr>
                 <w:sz w:val="12"/>
               </w:rPr>
-              <w:t>{capacitacion_no}</w:t>
+              <w:t>{</w:t>
+            </w:r>
+            <w:proofErr w:type="spellStart"/>
+            <w:r>
+              <w:rPr>
+                <w:sz w:val="12"/>
+              </w:rPr>
+              <w:t>capacitacion_no</w:t>
+            </w:r>
+            <w:proofErr w:type="spellEnd"/>
+            <w:r>
+              <w:rPr>
+                <w:sz w:val="12"/>
+              </w:rPr>
+              <w:t>}</w:t>
             </w:r>
           </w:p>
         </w:tc>
@@ -9489,20 +10627,33 @@
               <w:bottom w:val="single" w:sz="4" w:space="0" w:color="auto"/>
               <w:right w:val="single" w:sz="4" w:space="0" w:color="auto"/>
             </w:tcBorders>
-            <w:shd w:val="clear" w:color="auto" w:fill="auto"/>
-            <w:vAlign w:val="bottom"/>
-          </w:tcPr>
-          <w:p>
-            <w:pPr>
-              <w:rPr>
-                <w:rFonts w:ascii="Arial" w:hAnsi="Arial" w:cs="Arial"/>
-              </w:rPr>
-            </w:pPr>
-            <w:r>
-              <w:rPr>
-                <w:sz w:val="12"/>
-              </w:rPr>
-              <w:t>{capacitacion_na}</w:t>
+            <w:vAlign w:val="bottom"/>
+          </w:tcPr>
+          <w:p>
+            <w:pPr>
+              <w:rPr>
+                <w:rFonts w:ascii="Arial" w:hAnsi="Arial" w:cs="Arial"/>
+              </w:rPr>
+            </w:pPr>
+            <w:r>
+              <w:rPr>
+                <w:sz w:val="12"/>
+              </w:rPr>
+              <w:t>{</w:t>
+            </w:r>
+            <w:proofErr w:type="spellStart"/>
+            <w:r>
+              <w:rPr>
+                <w:sz w:val="12"/>
+              </w:rPr>
+              <w:t>capacitacion_na</w:t>
+            </w:r>
+            <w:proofErr w:type="spellEnd"/>
+            <w:r>
+              <w:rPr>
+                <w:sz w:val="12"/>
+              </w:rPr>
+              <w:t>}</w:t>
             </w:r>
           </w:p>
         </w:tc>
@@ -9528,30 +10679,28 @@
           <w:rFonts w:ascii="Arial" w:hAnsi="Arial" w:cs="Arial"/>
           <w:lang w:val="es-CO"/>
         </w:rPr>
-        <w:t xml:space="preserve">&lt; </w:t>
-      </w:r>
-      <w:proofErr w:type="gramStart"/>
-      <w:r>
-        <w:rPr>
-          <w:rFonts w:ascii="Arial" w:hAnsi="Arial" w:cs="Arial"/>
-          <w:lang w:val="es-CO"/>
-        </w:rPr>
-        <w:t>Observaciones  sobre</w:t>
-      </w:r>
-      <w:proofErr w:type="gramEnd"/>
-      <w:r>
-        <w:rPr>
-          <w:rFonts w:ascii="Arial" w:hAnsi="Arial" w:cs="Arial"/>
-          <w:lang w:val="es-CO"/>
-        </w:rPr>
-        <w:t xml:space="preserve"> capacitación de usuarios&gt;</w:t>
+        <w:t>&lt; Observaciones  sobre capacitación de usuarios&gt;</w:t>
       </w:r>
       <w:r>
         <w:rPr>
           <w:sz w:val="18"/>
         </w:rPr>
         <w:br/>
-        <w:t>{observaciones_capacitacion_usuarios}</w:t>
+        <w:t>{</w:t>
+      </w:r>
+      <w:proofErr w:type="spellStart"/>
+      <w:r>
+        <w:rPr>
+          <w:sz w:val="18"/>
+        </w:rPr>
+        <w:t>observaciones_capacitacion_usuarios</w:t>
+      </w:r>
+      <w:proofErr w:type="spellEnd"/>
+      <w:r>
+        <w:rPr>
+          <w:sz w:val="18"/>
+        </w:rPr>
+        <w:t>}</w:t>
       </w:r>
     </w:p>
     <w:p>
@@ -9599,7 +10748,27 @@
           <w:sz w:val="18"/>
         </w:rPr>
         <w:br/>
-        <w:t>{formatos_capacitacion_firmados}</w:t>
+        <w:t>{</w:t>
+      </w:r>
+      <w:r>
+        <w:rPr>
+          <w:sz w:val="18"/>
+        </w:rPr>
+        <w:t>%</w:t>
+      </w:r>
+      <w:proofErr w:type="spellStart"/>
+      <w:r>
+        <w:rPr>
+          <w:sz w:val="18"/>
+        </w:rPr>
+        <w:t>formatos_capacitacion_firmados</w:t>
+      </w:r>
+      <w:proofErr w:type="spellEnd"/>
+      <w:r>
+        <w:rPr>
+          <w:sz w:val="18"/>
+        </w:rPr>
+        <w:t>}</w:t>
       </w:r>
     </w:p>
     <w:p>
@@ -9666,30 +10835,28 @@
           <w:rFonts w:ascii="Arial" w:hAnsi="Arial" w:cs="Arial"/>
           <w:lang w:val="es-CO"/>
         </w:rPr>
-        <w:t xml:space="preserve">&lt; </w:t>
-      </w:r>
-      <w:proofErr w:type="gramStart"/>
-      <w:r>
-        <w:rPr>
-          <w:rFonts w:ascii="Arial" w:hAnsi="Arial" w:cs="Arial"/>
-          <w:lang w:val="es-CO"/>
-        </w:rPr>
-        <w:t>Observaciones  de</w:t>
-      </w:r>
-      <w:proofErr w:type="gramEnd"/>
-      <w:r>
-        <w:rPr>
-          <w:rFonts w:ascii="Arial" w:hAnsi="Arial" w:cs="Arial"/>
-          <w:lang w:val="es-CO"/>
-        </w:rPr>
-        <w:t xml:space="preserve"> la actividad&gt;</w:t>
+        <w:t>&lt; Observaciones  de la actividad&gt;</w:t>
       </w:r>
       <w:r>
         <w:rPr>
           <w:sz w:val="18"/>
         </w:rPr>
         <w:br/>
-        <w:t>{observaciones_actividad}</w:t>
+        <w:t>{</w:t>
+      </w:r>
+      <w:proofErr w:type="spellStart"/>
+      <w:r>
+        <w:rPr>
+          <w:sz w:val="18"/>
+        </w:rPr>
+        <w:t>observaciones_actividad</w:t>
+      </w:r>
+      <w:proofErr w:type="spellEnd"/>
+      <w:r>
+        <w:rPr>
+          <w:sz w:val="18"/>
+        </w:rPr>
+        <w:t>}</w:t>
       </w:r>
     </w:p>
     <w:p>
@@ -9762,7 +10929,27 @@
           <w:sz w:val="18"/>
         </w:rPr>
         <w:br/>
-        <w:t>{foto_acta_entrega_servicio}</w:t>
+        <w:t>{</w:t>
+      </w:r>
+      <w:r>
+        <w:rPr>
+          <w:sz w:val="18"/>
+        </w:rPr>
+        <w:t>%</w:t>
+      </w:r>
+      <w:proofErr w:type="spellStart"/>
+      <w:r>
+        <w:rPr>
+          <w:sz w:val="18"/>
+        </w:rPr>
+        <w:t>foto_acta_entrega_servicio</w:t>
+      </w:r>
+      <w:proofErr w:type="spellEnd"/>
+      <w:r>
+        <w:rPr>
+          <w:sz w:val="18"/>
+        </w:rPr>
+        <w:t>}</w:t>
       </w:r>
     </w:p>
     <w:p>
@@ -9867,7 +11054,7 @@
 </file>
 
 <file path=word/endnotes.xml><?xml version="1.0" encoding="utf-8"?>
-<w:endnotes xmlns:wpc="http://schemas.microsoft.com/office/word/2010/wordprocessingCanvas" xmlns:cx="http://schemas.microsoft.com/office/drawing/2014/chartex" xmlns:cx1="http://schemas.microsoft.com/office/drawing/2015/9/8/chartex" xmlns:cx2="http://schemas.microsoft.com/office/drawing/2015/10/21/chartex" xmlns:cx3="http://schemas.microsoft.com/office/drawing/2016/5/9/chartex" xmlns:cx4="http://schemas.microsoft.com/office/drawing/2016/5/10/chartex" xmlns:cx5="http://schemas.microsoft.com/office/drawing/2016/5/11/chartex" xmlns:cx6="http://schemas.microsoft.com/office/drawing/2016/5/12/chartex" xmlns:cx7="http://schemas.microsoft.com/office/drawing/2016/5/13/chartex" xmlns:cx8="http://schemas.microsoft.com/office/drawing/2016/5/14/chartex" xmlns:mc="http://schemas.openxmlformats.org/markup-compatibility/2006" xmlns:aink="http://schemas.microsoft.com/office/drawing/2016/ink" xmlns:am3d="http://schemas.microsoft.com/office/drawing/2017/model3d" xmlns:o="urn:schemas-microsoft-com:office:office" xmlns:oel="http://schemas.microsoft.com/office/2019/extlst" xmlns:r="http://schemas.openxmlformats.org/officeDocument/2006/relationships" xmlns:m="http://schemas.openxmlformats.org/officeDocument/2006/math" xmlns:v="urn:schemas-microsoft-com:vml" xmlns:wp14="http://schemas.microsoft.com/office/word/2010/wordprocessingDrawing" xmlns:wp="http://schemas.openxmlformats.org/drawingml/2006/wordprocessingDrawing" xmlns:w10="urn:schemas-microsoft-com:office:word" xmlns:w="http://schemas.openxmlformats.org/wordprocessingml/2006/main" xmlns:w14="http://schemas.microsoft.com/office/word/2010/wordml" xmlns:w15="http://schemas.microsoft.com/office/word/2012/wordml" xmlns:w16cex="http://schemas.microsoft.com/office/word/2018/wordml/cex" xmlns:w16cid="http://schemas.microsoft.com/office/word/2016/wordml/cid" xmlns:w16="http://schemas.microsoft.com/office/word/2018/wordml" xmlns:w16du="http://schemas.microsoft.com/office/word/2023/wordml/word16du" xmlns:w16sdtdh="http://schemas.microsoft.com/office/word/2020/wordml/sdtdatahash" xmlns:w16se="http://schemas.microsoft.com/office/word/2015/wordml/symex" xmlns:wpg="http://schemas.microsoft.com/office/word/2010/wordprocessingGroup" xmlns:wpi="http://schemas.microsoft.com/office/word/2010/wordprocessingInk" xmlns:wne="http://schemas.microsoft.com/office/word/2006/wordml" xmlns:wps="http://schemas.microsoft.com/office/word/2010/wordprocessingShape" mc:Ignorable="w14 w15 w16se w16cid w16 w16cex w16sdtdh w16du wp14">
+<w:endnotes xmlns:wpc="http://schemas.microsoft.com/office/word/2010/wordprocessingCanvas" xmlns:cx="http://schemas.microsoft.com/office/drawing/2014/chartex" xmlns:cx1="http://schemas.microsoft.com/office/drawing/2015/9/8/chartex" xmlns:cx2="http://schemas.microsoft.com/office/drawing/2015/10/21/chartex" xmlns:cx3="http://schemas.microsoft.com/office/drawing/2016/5/9/chartex" xmlns:cx4="http://schemas.microsoft.com/office/drawing/2016/5/10/chartex" xmlns:cx5="http://schemas.microsoft.com/office/drawing/2016/5/11/chartex" xmlns:cx6="http://schemas.microsoft.com/office/drawing/2016/5/12/chartex" xmlns:cx7="http://schemas.microsoft.com/office/drawing/2016/5/13/chartex" xmlns:cx8="http://schemas.microsoft.com/office/drawing/2016/5/14/chartex" xmlns:mc="http://schemas.openxmlformats.org/markup-compatibility/2006" xmlns:aink="http://schemas.microsoft.com/office/drawing/2016/ink" xmlns:am3d="http://schemas.microsoft.com/office/drawing/2017/model3d" xmlns:o="urn:schemas-microsoft-com:office:office" xmlns:oel="http://schemas.microsoft.com/office/2019/extlst" xmlns:r="http://schemas.openxmlformats.org/officeDocument/2006/relationships" xmlns:m="http://schemas.openxmlformats.org/officeDocument/2006/math" xmlns:v="urn:schemas-microsoft-com:vml" xmlns:wp14="http://schemas.microsoft.com/office/word/2010/wordprocessingDrawing" xmlns:wp="http://schemas.openxmlformats.org/drawingml/2006/wordprocessingDrawing" xmlns:w10="urn:schemas-microsoft-com:office:word" xmlns:w="http://schemas.openxmlformats.org/wordprocessingml/2006/main" xmlns:w14="http://schemas.microsoft.com/office/word/2010/wordml" xmlns:w15="http://schemas.microsoft.com/office/word/2012/wordml" xmlns:w16cex="http://schemas.microsoft.com/office/word/2018/wordml/cex" xmlns:w16cid="http://schemas.microsoft.com/office/word/2016/wordml/cid" xmlns:w16="http://schemas.microsoft.com/office/word/2018/wordml" xmlns:w16du="http://schemas.microsoft.com/office/word/2023/wordml/word16du" xmlns:w16sdtdh="http://schemas.microsoft.com/office/word/2020/wordml/sdtdatahash" xmlns:w16sdtfl="http://schemas.microsoft.com/office/word/2024/wordml/sdtformatlock" xmlns:w16se="http://schemas.microsoft.com/office/word/2015/wordml/symex" xmlns:wpg="http://schemas.microsoft.com/office/word/2010/wordprocessingGroup" xmlns:wpi="http://schemas.microsoft.com/office/word/2010/wordprocessingInk" xmlns:wne="http://schemas.microsoft.com/office/word/2006/wordml" xmlns:wps="http://schemas.microsoft.com/office/word/2010/wordprocessingShape" mc:Ignorable="w14 w15 w16se w16cid w16 w16cex w16sdtdh w16sdtfl w16du wp14">
   <w:endnote w:type="separator" w:id="-1">
     <w:p>
       <w:r>
@@ -9886,7 +11073,7 @@
 </file>
 
 <file path=word/footer1.xml><?xml version="1.0" encoding="utf-8"?>
-<w:ftr xmlns:wpc="http://schemas.microsoft.com/office/word/2010/wordprocessingCanvas" xmlns:cx="http://schemas.microsoft.com/office/drawing/2014/chartex" xmlns:cx1="http://schemas.microsoft.com/office/drawing/2015/9/8/chartex" xmlns:cx2="http://schemas.microsoft.com/office/drawing/2015/10/21/chartex" xmlns:cx3="http://schemas.microsoft.com/office/drawing/2016/5/9/chartex" xmlns:cx4="http://schemas.microsoft.com/office/drawing/2016/5/10/chartex" xmlns:cx5="http://schemas.microsoft.com/office/drawing/2016/5/11/chartex" xmlns:cx6="http://schemas.microsoft.com/office/drawing/2016/5/12/chartex" xmlns:cx7="http://schemas.microsoft.com/office/drawing/2016/5/13/chartex" xmlns:cx8="http://schemas.microsoft.com/office/drawing/2016/5/14/chartex" xmlns:mc="http://schemas.openxmlformats.org/markup-compatibility/2006" xmlns:aink="http://schemas.microsoft.com/office/drawing/2016/ink" xmlns:am3d="http://schemas.microsoft.com/office/drawing/2017/model3d" xmlns:o="urn:schemas-microsoft-com:office:office" xmlns:oel="http://schemas.microsoft.com/office/2019/extlst" xmlns:r="http://schemas.openxmlformats.org/officeDocument/2006/relationships" xmlns:m="http://schemas.openxmlformats.org/officeDocument/2006/math" xmlns:v="urn:schemas-microsoft-com:vml" xmlns:wp14="http://schemas.microsoft.com/office/word/2010/wordprocessingDrawing" xmlns:wp="http://schemas.openxmlformats.org/drawingml/2006/wordprocessingDrawing" xmlns:w10="urn:schemas-microsoft-com:office:word" xmlns:w="http://schemas.openxmlformats.org/wordprocessingml/2006/main" xmlns:w14="http://schemas.microsoft.com/office/word/2010/wordml" xmlns:w15="http://schemas.microsoft.com/office/word/2012/wordml" xmlns:w16cex="http://schemas.microsoft.com/office/word/2018/wordml/cex" xmlns:w16cid="http://schemas.microsoft.com/office/word/2016/wordml/cid" xmlns:w16="http://schemas.microsoft.com/office/word/2018/wordml" xmlns:w16du="http://schemas.microsoft.com/office/word/2023/wordml/word16du" xmlns:w16sdtdh="http://schemas.microsoft.com/office/word/2020/wordml/sdtdatahash" xmlns:w16se="http://schemas.microsoft.com/office/word/2015/wordml/symex" xmlns:wpg="http://schemas.microsoft.com/office/word/2010/wordprocessingGroup" xmlns:wpi="http://schemas.microsoft.com/office/word/2010/wordprocessingInk" xmlns:wne="http://schemas.microsoft.com/office/word/2006/wordml" xmlns:wps="http://schemas.microsoft.com/office/word/2010/wordprocessingShape" mc:Ignorable="w14 w15 w16se w16cid w16 w16cex w16sdtdh w16du wp14">
+<w:ftr xmlns:wpc="http://schemas.microsoft.com/office/word/2010/wordprocessingCanvas" xmlns:cx="http://schemas.microsoft.com/office/drawing/2014/chartex" xmlns:cx1="http://schemas.microsoft.com/office/drawing/2015/9/8/chartex" xmlns:cx2="http://schemas.microsoft.com/office/drawing/2015/10/21/chartex" xmlns:cx3="http://schemas.microsoft.com/office/drawing/2016/5/9/chartex" xmlns:cx4="http://schemas.microsoft.com/office/drawing/2016/5/10/chartex" xmlns:cx5="http://schemas.microsoft.com/office/drawing/2016/5/11/chartex" xmlns:cx6="http://schemas.microsoft.com/office/drawing/2016/5/12/chartex" xmlns:cx7="http://schemas.microsoft.com/office/drawing/2016/5/13/chartex" xmlns:cx8="http://schemas.microsoft.com/office/drawing/2016/5/14/chartex" xmlns:mc="http://schemas.openxmlformats.org/markup-compatibility/2006" xmlns:aink="http://schemas.microsoft.com/office/drawing/2016/ink" xmlns:am3d="http://schemas.microsoft.com/office/drawing/2017/model3d" xmlns:o="urn:schemas-microsoft-com:office:office" xmlns:oel="http://schemas.microsoft.com/office/2019/extlst" xmlns:r="http://schemas.openxmlformats.org/officeDocument/2006/relationships" xmlns:m="http://schemas.openxmlformats.org/officeDocument/2006/math" xmlns:v="urn:schemas-microsoft-com:vml" xmlns:wp14="http://schemas.microsoft.com/office/word/2010/wordprocessingDrawing" xmlns:wp="http://schemas.openxmlformats.org/drawingml/2006/wordprocessingDrawing" xmlns:w10="urn:schemas-microsoft-com:office:word" xmlns:w="http://schemas.openxmlformats.org/wordprocessingml/2006/main" xmlns:w14="http://schemas.microsoft.com/office/word/2010/wordml" xmlns:w15="http://schemas.microsoft.com/office/word/2012/wordml" xmlns:w16cex="http://schemas.microsoft.com/office/word/2018/wordml/cex" xmlns:w16cid="http://schemas.microsoft.com/office/word/2016/wordml/cid" xmlns:w16="http://schemas.microsoft.com/office/word/2018/wordml" xmlns:w16du="http://schemas.microsoft.com/office/word/2023/wordml/word16du" xmlns:w16sdtdh="http://schemas.microsoft.com/office/word/2020/wordml/sdtdatahash" xmlns:w16sdtfl="http://schemas.microsoft.com/office/word/2024/wordml/sdtformatlock" xmlns:w16se="http://schemas.microsoft.com/office/word/2015/wordml/symex" xmlns:wpg="http://schemas.microsoft.com/office/word/2010/wordprocessingGroup" xmlns:wpi="http://schemas.microsoft.com/office/word/2010/wordprocessingInk" xmlns:wne="http://schemas.microsoft.com/office/word/2006/wordml" xmlns:wps="http://schemas.microsoft.com/office/word/2010/wordprocessingShape" mc:Ignorable="w14 w15 w16se w16cid w16 w16cex w16sdtdh w16sdtfl w16du wp14">
   <w:p>
     <w:pPr>
       <w:pStyle w:val="Piedepgina"/>
@@ -9924,7 +11111,7 @@
 </file>
 
 <file path=word/footer2.xml><?xml version="1.0" encoding="utf-8"?>
-<w:ftr xmlns:wpc="http://schemas.microsoft.com/office/word/2010/wordprocessingCanvas" xmlns:cx="http://schemas.microsoft.com/office/drawing/2014/chartex" xmlns:cx1="http://schemas.microsoft.com/office/drawing/2015/9/8/chartex" xmlns:cx2="http://schemas.microsoft.com/office/drawing/2015/10/21/chartex" xmlns:cx3="http://schemas.microsoft.com/office/drawing/2016/5/9/chartex" xmlns:cx4="http://schemas.microsoft.com/office/drawing/2016/5/10/chartex" xmlns:cx5="http://schemas.microsoft.com/office/drawing/2016/5/11/chartex" xmlns:cx6="http://schemas.microsoft.com/office/drawing/2016/5/12/chartex" xmlns:cx7="http://schemas.microsoft.com/office/drawing/2016/5/13/chartex" xmlns:cx8="http://schemas.microsoft.com/office/drawing/2016/5/14/chartex" xmlns:mc="http://schemas.openxmlformats.org/markup-compatibility/2006" xmlns:aink="http://schemas.microsoft.com/office/drawing/2016/ink" xmlns:am3d="http://schemas.microsoft.com/office/drawing/2017/model3d" xmlns:o="urn:schemas-microsoft-com:office:office" xmlns:oel="http://schemas.microsoft.com/office/2019/extlst" xmlns:r="http://schemas.openxmlformats.org/officeDocument/2006/relationships" xmlns:m="http://schemas.openxmlformats.org/officeDocument/2006/math" xmlns:v="urn:schemas-microsoft-com:vml" xmlns:wp14="http://schemas.microsoft.com/office/word/2010/wordprocessingDrawing" xmlns:wp="http://schemas.openxmlformats.org/drawingml/2006/wordprocessingDrawing" xmlns:w10="urn:schemas-microsoft-com:office:word" xmlns:w="http://schemas.openxmlformats.org/wordprocessingml/2006/main" xmlns:w14="http://schemas.microsoft.com/office/word/2010/wordml" xmlns:w15="http://schemas.microsoft.com/office/word/2012/wordml" xmlns:w16cex="http://schemas.microsoft.com/office/word/2018/wordml/cex" xmlns:w16cid="http://schemas.microsoft.com/office/word/2016/wordml/cid" xmlns:w16="http://schemas.microsoft.com/office/word/2018/wordml" xmlns:w16du="http://schemas.microsoft.com/office/word/2023/wordml/word16du" xmlns:w16sdtdh="http://schemas.microsoft.com/office/word/2020/wordml/sdtdatahash" xmlns:w16se="http://schemas.microsoft.com/office/word/2015/wordml/symex" xmlns:wpg="http://schemas.microsoft.com/office/word/2010/wordprocessingGroup" xmlns:wpi="http://schemas.microsoft.com/office/word/2010/wordprocessingInk" xmlns:wne="http://schemas.microsoft.com/office/word/2006/wordml" xmlns:wps="http://schemas.microsoft.com/office/word/2010/wordprocessingShape" mc:Ignorable="w14 w15 w16se w16cid w16 w16cex w16sdtdh w16du wp14">
+<w:ftr xmlns:wpc="http://schemas.microsoft.com/office/word/2010/wordprocessingCanvas" xmlns:cx="http://schemas.microsoft.com/office/drawing/2014/chartex" xmlns:cx1="http://schemas.microsoft.com/office/drawing/2015/9/8/chartex" xmlns:cx2="http://schemas.microsoft.com/office/drawing/2015/10/21/chartex" xmlns:cx3="http://schemas.microsoft.com/office/drawing/2016/5/9/chartex" xmlns:cx4="http://schemas.microsoft.com/office/drawing/2016/5/10/chartex" xmlns:cx5="http://schemas.microsoft.com/office/drawing/2016/5/11/chartex" xmlns:cx6="http://schemas.microsoft.com/office/drawing/2016/5/12/chartex" xmlns:cx7="http://schemas.microsoft.com/office/drawing/2016/5/13/chartex" xmlns:cx8="http://schemas.microsoft.com/office/drawing/2016/5/14/chartex" xmlns:mc="http://schemas.openxmlformats.org/markup-compatibility/2006" xmlns:aink="http://schemas.microsoft.com/office/drawing/2016/ink" xmlns:am3d="http://schemas.microsoft.com/office/drawing/2017/model3d" xmlns:o="urn:schemas-microsoft-com:office:office" xmlns:oel="http://schemas.microsoft.com/office/2019/extlst" xmlns:r="http://schemas.openxmlformats.org/officeDocument/2006/relationships" xmlns:m="http://schemas.openxmlformats.org/officeDocument/2006/math" xmlns:v="urn:schemas-microsoft-com:vml" xmlns:wp14="http://schemas.microsoft.com/office/word/2010/wordprocessingDrawing" xmlns:wp="http://schemas.openxmlformats.org/drawingml/2006/wordprocessingDrawing" xmlns:w10="urn:schemas-microsoft-com:office:word" xmlns:w="http://schemas.openxmlformats.org/wordprocessingml/2006/main" xmlns:w14="http://schemas.microsoft.com/office/word/2010/wordml" xmlns:w15="http://schemas.microsoft.com/office/word/2012/wordml" xmlns:w16cex="http://schemas.microsoft.com/office/word/2018/wordml/cex" xmlns:w16cid="http://schemas.microsoft.com/office/word/2016/wordml/cid" xmlns:w16="http://schemas.microsoft.com/office/word/2018/wordml" xmlns:w16du="http://schemas.microsoft.com/office/word/2023/wordml/word16du" xmlns:w16sdtdh="http://schemas.microsoft.com/office/word/2020/wordml/sdtdatahash" xmlns:w16sdtfl="http://schemas.microsoft.com/office/word/2024/wordml/sdtformatlock" xmlns:w16se="http://schemas.microsoft.com/office/word/2015/wordml/symex" xmlns:wpg="http://schemas.microsoft.com/office/word/2010/wordprocessingGroup" xmlns:wpi="http://schemas.microsoft.com/office/word/2010/wordprocessingInk" xmlns:wne="http://schemas.microsoft.com/office/word/2006/wordml" xmlns:wps="http://schemas.microsoft.com/office/word/2010/wordprocessingShape" mc:Ignorable="w14 w15 w16se w16cid w16 w16cex w16sdtdh w16sdtfl w16du wp14">
   <w:p>
     <w:pPr>
       <w:pStyle w:val="Piedepgina"/>
@@ -9935,7 +11122,7 @@
 </file>
 
 <file path=word/footnotes.xml><?xml version="1.0" encoding="utf-8"?>
-<w:footnotes xmlns:wpc="http://schemas.microsoft.com/office/word/2010/wordprocessingCanvas" xmlns:cx="http://schemas.microsoft.com/office/drawing/2014/chartex" xmlns:cx1="http://schemas.microsoft.com/office/drawing/2015/9/8/chartex" xmlns:cx2="http://schemas.microsoft.com/office/drawing/2015/10/21/chartex" xmlns:cx3="http://schemas.microsoft.com/office/drawing/2016/5/9/chartex" xmlns:cx4="http://schemas.microsoft.com/office/drawing/2016/5/10/chartex" xmlns:cx5="http://schemas.microsoft.com/office/drawing/2016/5/11/chartex" xmlns:cx6="http://schemas.microsoft.com/office/drawing/2016/5/12/chartex" xmlns:cx7="http://schemas.microsoft.com/office/drawing/2016/5/13/chartex" xmlns:cx8="http://schemas.microsoft.com/office/drawing/2016/5/14/chartex" xmlns:mc="http://schemas.openxmlformats.org/markup-compatibility/2006" xmlns:aink="http://schemas.microsoft.com/office/drawing/2016/ink" xmlns:am3d="http://schemas.microsoft.com/office/drawing/2017/model3d" xmlns:o="urn:schemas-microsoft-com:office:office" xmlns:oel="http://schemas.microsoft.com/office/2019/extlst" xmlns:r="http://schemas.openxmlformats.org/officeDocument/2006/relationships" xmlns:m="http://schemas.openxmlformats.org/officeDocument/2006/math" xmlns:v="urn:schemas-microsoft-com:vml" xmlns:wp14="http://schemas.microsoft.com/office/word/2010/wordprocessingDrawing" xmlns:wp="http://schemas.openxmlformats.org/drawingml/2006/wordprocessingDrawing" xmlns:w10="urn:schemas-microsoft-com:office:word" xmlns:w="http://schemas.openxmlformats.org/wordprocessingml/2006/main" xmlns:w14="http://schemas.microsoft.com/office/word/2010/wordml" xmlns:w15="http://schemas.microsoft.com/office/word/2012/wordml" xmlns:w16cex="http://schemas.microsoft.com/office/word/2018/wordml/cex" xmlns:w16cid="http://schemas.microsoft.com/office/word/2016/wordml/cid" xmlns:w16="http://schemas.microsoft.com/office/word/2018/wordml" xmlns:w16du="http://schemas.microsoft.com/office/word/2023/wordml/word16du" xmlns:w16sdtdh="http://schemas.microsoft.com/office/word/2020/wordml/sdtdatahash" xmlns:w16se="http://schemas.microsoft.com/office/word/2015/wordml/symex" xmlns:wpg="http://schemas.microsoft.com/office/word/2010/wordprocessingGroup" xmlns:wpi="http://schemas.microsoft.com/office/word/2010/wordprocessingInk" xmlns:wne="http://schemas.microsoft.com/office/word/2006/wordml" xmlns:wps="http://schemas.microsoft.com/office/word/2010/wordprocessingShape" mc:Ignorable="w14 w15 w16se w16cid w16 w16cex w16sdtdh w16du wp14">
+<w:footnotes xmlns:wpc="http://schemas.microsoft.com/office/word/2010/wordprocessingCanvas" xmlns:cx="http://schemas.microsoft.com/office/drawing/2014/chartex" xmlns:cx1="http://schemas.microsoft.com/office/drawing/2015/9/8/chartex" xmlns:cx2="http://schemas.microsoft.com/office/drawing/2015/10/21/chartex" xmlns:cx3="http://schemas.microsoft.com/office/drawing/2016/5/9/chartex" xmlns:cx4="http://schemas.microsoft.com/office/drawing/2016/5/10/chartex" xmlns:cx5="http://schemas.microsoft.com/office/drawing/2016/5/11/chartex" xmlns:cx6="http://schemas.microsoft.com/office/drawing/2016/5/12/chartex" xmlns:cx7="http://schemas.microsoft.com/office/drawing/2016/5/13/chartex" xmlns:cx8="http://schemas.microsoft.com/office/drawing/2016/5/14/chartex" xmlns:mc="http://schemas.openxmlformats.org/markup-compatibility/2006" xmlns:aink="http://schemas.microsoft.com/office/drawing/2016/ink" xmlns:am3d="http://schemas.microsoft.com/office/drawing/2017/model3d" xmlns:o="urn:schemas-microsoft-com:office:office" xmlns:oel="http://schemas.microsoft.com/office/2019/extlst" xmlns:r="http://schemas.openxmlformats.org/officeDocument/2006/relationships" xmlns:m="http://schemas.openxmlformats.org/officeDocument/2006/math" xmlns:v="urn:schemas-microsoft-com:vml" xmlns:wp14="http://schemas.microsoft.com/office/word/2010/wordprocessingDrawing" xmlns:wp="http://schemas.openxmlformats.org/drawingml/2006/wordprocessingDrawing" xmlns:w10="urn:schemas-microsoft-com:office:word" xmlns:w="http://schemas.openxmlformats.org/wordprocessingml/2006/main" xmlns:w14="http://schemas.microsoft.com/office/word/2010/wordml" xmlns:w15="http://schemas.microsoft.com/office/word/2012/wordml" xmlns:w16cex="http://schemas.microsoft.com/office/word/2018/wordml/cex" xmlns:w16cid="http://schemas.microsoft.com/office/word/2016/wordml/cid" xmlns:w16="http://schemas.microsoft.com/office/word/2018/wordml" xmlns:w16du="http://schemas.microsoft.com/office/word/2023/wordml/word16du" xmlns:w16sdtdh="http://schemas.microsoft.com/office/word/2020/wordml/sdtdatahash" xmlns:w16sdtfl="http://schemas.microsoft.com/office/word/2024/wordml/sdtformatlock" xmlns:w16se="http://schemas.microsoft.com/office/word/2015/wordml/symex" xmlns:wpg="http://schemas.microsoft.com/office/word/2010/wordprocessingGroup" xmlns:wpi="http://schemas.microsoft.com/office/word/2010/wordprocessingInk" xmlns:wne="http://schemas.microsoft.com/office/word/2006/wordml" xmlns:wps="http://schemas.microsoft.com/office/word/2010/wordprocessingShape" mc:Ignorable="w14 w15 w16se w16cid w16 w16cex w16sdtdh w16sdtfl w16du wp14">
   <w:footnote w:type="separator" w:id="-1">
     <w:p>
       <w:r>
@@ -9954,7 +11141,7 @@
 </file>
 
 <file path=word/header1.xml><?xml version="1.0" encoding="utf-8"?>
-<w:hdr xmlns:wpc="http://schemas.microsoft.com/office/word/2010/wordprocessingCanvas" xmlns:cx="http://schemas.microsoft.com/office/drawing/2014/chartex" xmlns:cx1="http://schemas.microsoft.com/office/drawing/2015/9/8/chartex" xmlns:cx2="http://schemas.microsoft.com/office/drawing/2015/10/21/chartex" xmlns:cx3="http://schemas.microsoft.com/office/drawing/2016/5/9/chartex" xmlns:cx4="http://schemas.microsoft.com/office/drawing/2016/5/10/chartex" xmlns:cx5="http://schemas.microsoft.com/office/drawing/2016/5/11/chartex" xmlns:cx6="http://schemas.microsoft.com/office/drawing/2016/5/12/chartex" xmlns:cx7="http://schemas.microsoft.com/office/drawing/2016/5/13/chartex" xmlns:cx8="http://schemas.microsoft.com/office/drawing/2016/5/14/chartex" xmlns:mc="http://schemas.openxmlformats.org/markup-compatibility/2006" xmlns:aink="http://schemas.microsoft.com/office/drawing/2016/ink" xmlns:am3d="http://schemas.microsoft.com/office/drawing/2017/model3d" xmlns:o="urn:schemas-microsoft-com:office:office" xmlns:oel="http://schemas.microsoft.com/office/2019/extlst" xmlns:r="http://schemas.openxmlformats.org/officeDocument/2006/relationships" xmlns:m="http://schemas.openxmlformats.org/officeDocument/2006/math" xmlns:v="urn:schemas-microsoft-com:vml" xmlns:wp14="http://schemas.microsoft.com/office/word/2010/wordprocessingDrawing" xmlns:wp="http://schemas.openxmlformats.org/drawingml/2006/wordprocessingDrawing" xmlns:w10="urn:schemas-microsoft-com:office:word" xmlns:w="http://schemas.openxmlformats.org/wordprocessingml/2006/main" xmlns:w14="http://schemas.microsoft.com/office/word/2010/wordml" xmlns:w15="http://schemas.microsoft.com/office/word/2012/wordml" xmlns:w16cex="http://schemas.microsoft.com/office/word/2018/wordml/cex" xmlns:w16cid="http://schemas.microsoft.com/office/word/2016/wordml/cid" xmlns:w16="http://schemas.microsoft.com/office/word/2018/wordml" xmlns:w16du="http://schemas.microsoft.com/office/word/2023/wordml/word16du" xmlns:w16sdtdh="http://schemas.microsoft.com/office/word/2020/wordml/sdtdatahash" xmlns:w16se="http://schemas.microsoft.com/office/word/2015/wordml/symex" xmlns:wpg="http://schemas.microsoft.com/office/word/2010/wordprocessingGroup" xmlns:wpi="http://schemas.microsoft.com/office/word/2010/wordprocessingInk" xmlns:wne="http://schemas.microsoft.com/office/word/2006/wordml" xmlns:wps="http://schemas.microsoft.com/office/word/2010/wordprocessingShape" mc:Ignorable="w14 w15 w16se w16cid w16 w16cex w16sdtdh w16du wp14">
+<w:hdr xmlns:wpc="http://schemas.microsoft.com/office/word/2010/wordprocessingCanvas" xmlns:cx="http://schemas.microsoft.com/office/drawing/2014/chartex" xmlns:cx1="http://schemas.microsoft.com/office/drawing/2015/9/8/chartex" xmlns:cx2="http://schemas.microsoft.com/office/drawing/2015/10/21/chartex" xmlns:cx3="http://schemas.microsoft.com/office/drawing/2016/5/9/chartex" xmlns:cx4="http://schemas.microsoft.com/office/drawing/2016/5/10/chartex" xmlns:cx5="http://schemas.microsoft.com/office/drawing/2016/5/11/chartex" xmlns:cx6="http://schemas.microsoft.com/office/drawing/2016/5/12/chartex" xmlns:cx7="http://schemas.microsoft.com/office/drawing/2016/5/13/chartex" xmlns:cx8="http://schemas.microsoft.com/office/drawing/2016/5/14/chartex" xmlns:mc="http://schemas.openxmlformats.org/markup-compatibility/2006" xmlns:aink="http://schemas.microsoft.com/office/drawing/2016/ink" xmlns:am3d="http://schemas.microsoft.com/office/drawing/2017/model3d" xmlns:o="urn:schemas-microsoft-com:office:office" xmlns:oel="http://schemas.microsoft.com/office/2019/extlst" xmlns:r="http://schemas.openxmlformats.org/officeDocument/2006/relationships" xmlns:m="http://schemas.openxmlformats.org/officeDocument/2006/math" xmlns:v="urn:schemas-microsoft-com:vml" xmlns:wp14="http://schemas.microsoft.com/office/word/2010/wordprocessingDrawing" xmlns:wp="http://schemas.openxmlformats.org/drawingml/2006/wordprocessingDrawing" xmlns:w10="urn:schemas-microsoft-com:office:word" xmlns:w="http://schemas.openxmlformats.org/wordprocessingml/2006/main" xmlns:w14="http://schemas.microsoft.com/office/word/2010/wordml" xmlns:w15="http://schemas.microsoft.com/office/word/2012/wordml" xmlns:w16cex="http://schemas.microsoft.com/office/word/2018/wordml/cex" xmlns:w16cid="http://schemas.microsoft.com/office/word/2016/wordml/cid" xmlns:w16="http://schemas.microsoft.com/office/word/2018/wordml" xmlns:w16du="http://schemas.microsoft.com/office/word/2023/wordml/word16du" xmlns:w16sdtdh="http://schemas.microsoft.com/office/word/2020/wordml/sdtdatahash" xmlns:w16sdtfl="http://schemas.microsoft.com/office/word/2024/wordml/sdtformatlock" xmlns:w16se="http://schemas.microsoft.com/office/word/2015/wordml/symex" xmlns:wpg="http://schemas.microsoft.com/office/word/2010/wordprocessingGroup" xmlns:wpi="http://schemas.microsoft.com/office/word/2010/wordprocessingInk" xmlns:wne="http://schemas.microsoft.com/office/word/2006/wordml" xmlns:wps="http://schemas.microsoft.com/office/word/2010/wordprocessingShape" mc:Ignorable="w14 w15 w16se w16cid w16 w16cex w16sdtdh w16sdtfl w16du wp14">
   <w:tbl>
     <w:tblPr>
       <w:tblW w:w="9232" w:type="dxa"/>
@@ -10082,7 +11269,7 @@
               <v:shape id="_x0000_i1025" type="#_x0000_t75" style="width:57.75pt;height:57.75pt">
                 <v:imagedata r:id="rId1" o:title=""/>
               </v:shape>
-              <o:OLEObject Type="Embed" ProgID="Visio.Drawing.11" ShapeID="_x0000_i1025" DrawAspect="Content" ObjectID="_1842525668" r:id="rId2"/>
+              <o:OLEObject Type="Embed" ProgID="Visio.Drawing.11" ShapeID="_x0000_i1025" DrawAspect="Content" ObjectID="_1843756741" r:id="rId2"/>
             </w:object>
           </w:r>
         </w:p>
@@ -10433,7 +11620,7 @@
 </file>
 
 <file path=word/numbering.xml><?xml version="1.0" encoding="utf-8"?>
-<w:numbering xmlns:wpc="http://schemas.microsoft.com/office/word/2010/wordprocessingCanvas" xmlns:cx="http://schemas.microsoft.com/office/drawing/2014/chartex" xmlns:cx1="http://schemas.microsoft.com/office/drawing/2015/9/8/chartex" xmlns:cx2="http://schemas.microsoft.com/office/drawing/2015/10/21/chartex" xmlns:cx3="http://schemas.microsoft.com/office/drawing/2016/5/9/chartex" xmlns:cx4="http://schemas.microsoft.com/office/drawing/2016/5/10/chartex" xmlns:cx5="http://schemas.microsoft.com/office/drawing/2016/5/11/chartex" xmlns:cx6="http://schemas.microsoft.com/office/drawing/2016/5/12/chartex" xmlns:cx7="http://schemas.microsoft.com/office/drawing/2016/5/13/chartex" xmlns:cx8="http://schemas.microsoft.com/office/drawing/2016/5/14/chartex" xmlns:mc="http://schemas.openxmlformats.org/markup-compatibility/2006" xmlns:aink="http://schemas.microsoft.com/office/drawing/2016/ink" xmlns:am3d="http://schemas.microsoft.com/office/drawing/2017/model3d" xmlns:o="urn:schemas-microsoft-com:office:office" xmlns:oel="http://schemas.microsoft.com/office/2019/extlst" xmlns:r="http://schemas.openxmlformats.org/officeDocument/2006/relationships" xmlns:m="http://schemas.openxmlformats.org/officeDocument/2006/math" xmlns:v="urn:schemas-microsoft-com:vml" xmlns:wp14="http://schemas.microsoft.com/office/word/2010/wordprocessingDrawing" xmlns:wp="http://schemas.openxmlformats.org/drawingml/2006/wordprocessingDrawing" xmlns:w10="urn:schemas-microsoft-com:office:word" xmlns:w="http://schemas.openxmlformats.org/wordprocessingml/2006/main" xmlns:w14="http://schemas.microsoft.com/office/word/2010/wordml" xmlns:w15="http://schemas.microsoft.com/office/word/2012/wordml" xmlns:w16cex="http://schemas.microsoft.com/office/word/2018/wordml/cex" xmlns:w16cid="http://schemas.microsoft.com/office/word/2016/wordml/cid" xmlns:w16="http://schemas.microsoft.com/office/word/2018/wordml" xmlns:w16du="http://schemas.microsoft.com/office/word/2023/wordml/word16du" xmlns:w16sdtdh="http://schemas.microsoft.com/office/word/2020/wordml/sdtdatahash" xmlns:w16se="http://schemas.microsoft.com/office/word/2015/wordml/symex" xmlns:wpg="http://schemas.microsoft.com/office/word/2010/wordprocessingGroup" xmlns:wpi="http://schemas.microsoft.com/office/word/2010/wordprocessingInk" xmlns:wne="http://schemas.microsoft.com/office/word/2006/wordml" xmlns:wps="http://schemas.microsoft.com/office/word/2010/wordprocessingShape" mc:Ignorable="w14 w15 w16se w16cid w16 w16cex w16sdtdh w16du wp14">
+<w:numbering xmlns:wpc="http://schemas.microsoft.com/office/word/2010/wordprocessingCanvas" xmlns:cx="http://schemas.microsoft.com/office/drawing/2014/chartex" xmlns:cx1="http://schemas.microsoft.com/office/drawing/2015/9/8/chartex" xmlns:cx2="http://schemas.microsoft.com/office/drawing/2015/10/21/chartex" xmlns:cx3="http://schemas.microsoft.com/office/drawing/2016/5/9/chartex" xmlns:cx4="http://schemas.microsoft.com/office/drawing/2016/5/10/chartex" xmlns:cx5="http://schemas.microsoft.com/office/drawing/2016/5/11/chartex" xmlns:cx6="http://schemas.microsoft.com/office/drawing/2016/5/12/chartex" xmlns:cx7="http://schemas.microsoft.com/office/drawing/2016/5/13/chartex" xmlns:cx8="http://schemas.microsoft.com/office/drawing/2016/5/14/chartex" xmlns:mc="http://schemas.openxmlformats.org/markup-compatibility/2006" xmlns:aink="http://schemas.microsoft.com/office/drawing/2016/ink" xmlns:am3d="http://schemas.microsoft.com/office/drawing/2017/model3d" xmlns:o="urn:schemas-microsoft-com:office:office" xmlns:oel="http://schemas.microsoft.com/office/2019/extlst" xmlns:r="http://schemas.openxmlformats.org/officeDocument/2006/relationships" xmlns:m="http://schemas.openxmlformats.org/officeDocument/2006/math" xmlns:v="urn:schemas-microsoft-com:vml" xmlns:wp14="http://schemas.microsoft.com/office/word/2010/wordprocessingDrawing" xmlns:wp="http://schemas.openxmlformats.org/drawingml/2006/wordprocessingDrawing" xmlns:w10="urn:schemas-microsoft-com:office:word" xmlns:w="http://schemas.openxmlformats.org/wordprocessingml/2006/main" xmlns:w14="http://schemas.microsoft.com/office/word/2010/wordml" xmlns:w15="http://schemas.microsoft.com/office/word/2012/wordml" xmlns:w16cex="http://schemas.microsoft.com/office/word/2018/wordml/cex" xmlns:w16cid="http://schemas.microsoft.com/office/word/2016/wordml/cid" xmlns:w16="http://schemas.microsoft.com/office/word/2018/wordml" xmlns:w16du="http://schemas.microsoft.com/office/word/2023/wordml/word16du" xmlns:w16sdtdh="http://schemas.microsoft.com/office/word/2020/wordml/sdtdatahash" xmlns:w16sdtfl="http://schemas.microsoft.com/office/word/2024/wordml/sdtformatlock" xmlns:w16se="http://schemas.microsoft.com/office/word/2015/wordml/symex" xmlns:wpg="http://schemas.microsoft.com/office/word/2010/wordprocessingGroup" xmlns:wpi="http://schemas.microsoft.com/office/word/2010/wordprocessingInk" xmlns:wne="http://schemas.microsoft.com/office/word/2006/wordml" xmlns:wps="http://schemas.microsoft.com/office/word/2010/wordprocessingShape" mc:Ignorable="w14 w15 w16se w16cid w16 w16cex w16sdtdh w16sdtfl w16du wp14">
   <w:abstractNum w:abstractNumId="0" w15:restartNumberingAfterBreak="0">
     <w:nsid w:val="0F2647E8"/>
     <w:multiLevelType w:val="multilevel"/>
@@ -11688,7 +12875,7 @@
 </file>
 
 <file path=word/styles.xml><?xml version="1.0" encoding="utf-8"?>
-<w:styles xmlns:mc="http://schemas.openxmlformats.org/markup-compatibility/2006" xmlns:r="http://schemas.openxmlformats.org/officeDocument/2006/relationships" xmlns:w="http://schemas.openxmlformats.org/wordprocessingml/2006/main" xmlns:w14="http://schemas.microsoft.com/office/word/2010/wordml" xmlns:w15="http://schemas.microsoft.com/office/word/2012/wordml" xmlns:w16cex="http://schemas.microsoft.com/office/word/2018/wordml/cex" xmlns:w16cid="http://schemas.microsoft.com/office/word/2016/wordml/cid" xmlns:w16="http://schemas.microsoft.com/office/word/2018/wordml" xmlns:w16du="http://schemas.microsoft.com/office/word/2023/wordml/word16du" xmlns:w16sdtdh="http://schemas.microsoft.com/office/word/2020/wordml/sdtdatahash" xmlns:w16se="http://schemas.microsoft.com/office/word/2015/wordml/symex" mc:Ignorable="w14 w15 w16se w16cid w16 w16cex w16sdtdh w16du">
+<w:styles xmlns:mc="http://schemas.openxmlformats.org/markup-compatibility/2006" xmlns:r="http://schemas.openxmlformats.org/officeDocument/2006/relationships" xmlns:w="http://schemas.openxmlformats.org/wordprocessingml/2006/main" xmlns:w14="http://schemas.microsoft.com/office/word/2010/wordml" xmlns:w15="http://schemas.microsoft.com/office/word/2012/wordml" xmlns:w16cex="http://schemas.microsoft.com/office/word/2018/wordml/cex" xmlns:w16cid="http://schemas.microsoft.com/office/word/2016/wordml/cid" xmlns:w16="http://schemas.microsoft.com/office/word/2018/wordml" xmlns:w16du="http://schemas.microsoft.com/office/word/2023/wordml/word16du" xmlns:w16sdtdh="http://schemas.microsoft.com/office/word/2020/wordml/sdtdatahash" xmlns:w16sdtfl="http://schemas.microsoft.com/office/word/2024/wordml/sdtformatlock" xmlns:w16se="http://schemas.microsoft.com/office/word/2015/wordml/symex" mc:Ignorable="w14 w15 w16se w16cid w16 w16cex w16sdtdh w16sdtfl w16du">
   <w:docDefaults>
     <w:rPrDefault>
       <w:rPr>

</xml_diff>